<commit_message>
WCNC: expand Sec II (link params table) + add sealed per-seed results table
- Table I: link-level parameters (3.5 GHz, 1 ms TTI, TDL-A, real 5G LDPC, NR MCS set
  TS 38.214, 400 blocks/pt BLER curves, targets, K=3 URLLC diversity).
- Table II: sealed per-seed results (URLLC eMBB/naive/aware; CSI naive/OLLA/fresh/CQI-err).
- Corrected the URLLC-aware mechanism to match the sealed code: conservative MCS backoff
  + K=3 diversity (a backoff ALONE cannot reach the 1e-3 tail) -- not a bare 2 dB margin.
- Method now names the MCS table, LDPC curve measurement, and TDL-A mobility explicitly.
Rebuilt PDF (IEEEtran) + DOCX; refs resolve clean.

Co-Authored-By: Claude Opus 4.8 <noreply@anthropic.com>
</commit_message>
<xml_diff>
--- a/paper/wcnc-csi/wcnc-csi.docx
+++ b/paper/wcnc-csi/wcnc-csi.docx
@@ -603,7 +603,7 @@
       </w:r>
     </w:p>
     <w:bookmarkEnd w:id="9"/>
-    <w:bookmarkStart w:id="10" w:name="method"/>
+    <w:bookmarkStart w:id="11" w:name="sec:method"/>
     <w:p>
       <w:pPr>
         <w:pStyle w:val="Heading1"/>
@@ -642,7 +642,193 @@
         <w:t xml:space="preserve"> </w:t>
       </w:r>
       <w:r>
-        <w:t xml:space="preserve">measured from the actual LDPC decoder rather than an SINR-to-BLER formula. The decoder</w:t>
+        <w:t xml:space="preserve">measured from the actual 5G LDPC decoder rather than an SINR-to-BLER formula. We first</w:t>
+      </w:r>
+      <w:r>
+        <w:t xml:space="preserve"> </w:t>
+      </w:r>
+      <w:r>
+        <w:t xml:space="preserve">measure a real</w:t>
+      </w:r>
+      <w:r>
+        <w:t xml:space="preserve"> </w:t>
+      </w:r>
+      <m:oMath>
+        <m:r>
+          <m:rPr>
+            <m:sty m:val="p"/>
+          </m:rPr>
+          <m:t>B</m:t>
+        </m:r>
+        <m:r>
+          <m:rPr>
+            <m:sty m:val="p"/>
+          </m:rPr>
+          <m:t>L</m:t>
+        </m:r>
+        <m:r>
+          <m:rPr>
+            <m:sty m:val="p"/>
+          </m:rPr>
+          <m:t>E</m:t>
+        </m:r>
+        <m:r>
+          <m:rPr>
+            <m:sty m:val="p"/>
+          </m:rPr>
+          <m:t>R</m:t>
+        </m:r>
+        <m:r>
+          <m:rPr>
+            <m:sty m:val="p"/>
+          </m:rPr>
+          <m:t>(</m:t>
+        </m:r>
+        <m:r>
+          <m:rPr>
+            <m:sty m:val="p"/>
+          </m:rPr>
+          <m:t>S</m:t>
+        </m:r>
+        <m:r>
+          <m:rPr>
+            <m:sty m:val="p"/>
+          </m:rPr>
+          <m:t>N</m:t>
+        </m:r>
+        <m:r>
+          <m:rPr>
+            <m:sty m:val="p"/>
+          </m:rPr>
+          <m:t>R</m:t>
+        </m:r>
+        <m:r>
+          <m:rPr>
+            <m:sty m:val="p"/>
+          </m:rPr>
+          <m:t>)</m:t>
+        </m:r>
+      </m:oMath>
+      <w:r>
+        <w:t xml:space="preserve"> </w:t>
+      </w:r>
+      <w:r>
+        <w:t xml:space="preserve">curve per MCS (400 coded blocks per SNR</w:t>
+      </w:r>
+      <w:r>
+        <w:t xml:space="preserve"> </w:t>
+      </w:r>
+      <w:r>
+        <w:t xml:space="preserve">point over the grid</w:t>
+      </w:r>
+      <w:r>
+        <w:t xml:space="preserve"> </w:t>
+      </w:r>
+      <m:oMath>
+        <m:r>
+          <m:rPr>
+            <m:sty m:val="p"/>
+          </m:rPr>
+          <m:t>−</m:t>
+        </m:r>
+        <m:r>
+          <m:t>8</m:t>
+        </m:r>
+      </m:oMath>
+      <w:r>
+        <w:t xml:space="preserve"> </w:t>
+      </w:r>
+      <w:r>
+        <w:t xml:space="preserve">to</w:t>
+      </w:r>
+      <w:r>
+        <w:t xml:space="preserve"> </w:t>
+      </w:r>
+      <m:oMath>
+        <m:r>
+          <m:t>28</m:t>
+        </m:r>
+      </m:oMath>
+      <w:r>
+        <w:t xml:space="preserve"> dB in</w:t>
+      </w:r>
+      <w:r>
+        <w:t xml:space="preserve"> </w:t>
+      </w:r>
+      <m:oMath>
+        <m:r>
+          <m:t>2</m:t>
+        </m:r>
+      </m:oMath>
+      <w:r>
+        <w:t xml:space="preserve"> dB steps), then drive a per-TTI SNR trace</w:t>
+      </w:r>
+      <w:r>
+        <w:t xml:space="preserve"> </w:t>
+      </w:r>
+      <w:r>
+        <w:t xml:space="preserve">through a 3GPP TR38.901 TDL-A channel at carrier</w:t>
+      </w:r>
+      <w:r>
+        <w:t xml:space="preserve"> </w:t>
+      </w:r>
+      <m:oMath>
+        <m:r>
+          <m:t>3.5</m:t>
+        </m:r>
+      </m:oMath>
+      <w:r>
+        <w:t xml:space="preserve"> GHz with a chosen Doppler, and</w:t>
+      </w:r>
+      <w:r>
+        <w:t xml:space="preserve"> </w:t>
+      </w:r>
+      <w:r>
+        <w:t xml:space="preserve">evaluate each policy’s selected MCS against the true instantaneous SNR through the</w:t>
+      </w:r>
+      <w:r>
+        <w:t xml:space="preserve"> </w:t>
+      </w:r>
+      <w:r>
+        <w:t xml:space="preserve">measured curve. The MCS set is the 3GPP NR table (TS 38.214 Table 5.1.3.1-1; QPSK</w:t>
+      </w:r>
+      <w:r>
+        <w:t xml:space="preserve"> </w:t>
+      </w:r>
+      <w:r>
+        <w:t xml:space="preserve">through 64-QAM, code rates floored at</w:t>
+      </w:r>
+      <w:r>
+        <w:t xml:space="preserve"> </w:t>
+      </w:r>
+      <m:oMath>
+        <m:r>
+          <m:t>R</m:t>
+        </m:r>
+        <m:r>
+          <m:rPr>
+            <m:sty m:val="p"/>
+          </m:rPr>
+          <m:t>≥</m:t>
+        </m:r>
+        <m:r>
+          <m:t>1</m:t>
+        </m:r>
+        <m:r>
+          <m:rPr>
+            <m:sty m:val="p"/>
+          </m:rPr>
+          <m:t>/</m:t>
+        </m:r>
+        <m:r>
+          <m:t>5</m:t>
+        </m:r>
+      </m:oMath>
+      <w:r>
+        <w:t xml:space="preserve"> </w:t>
+      </w:r>
+      <w:r>
+        <w:t xml:space="preserve">for the 5G LDPC base graph). The decoder</w:t>
       </w:r>
       <w:r>
         <w:t xml:space="preserve"> </w:t>
@@ -663,268 +849,13 @@
       <w:r>
         <w:t xml:space="preserve">: it independently determines whether the consumer decoded.</w:t>
       </w:r>
-    </w:p>
-    <w:p>
-      <w:pPr>
-        <w:pStyle w:val="BodyText"/>
-      </w:pPr>
-      <w:r>
-        <w:rPr>
-          <w:b/>
-          <w:bCs/>
-        </w:rPr>
-        <w:t xml:space="preserve">Certificate, consumer, witness.</w:t>
-      </w:r>
-      <w:r>
-        <w:t xml:space="preserve"> </w:t>
-      </w:r>
-      <w:r>
-        <w:t xml:space="preserve">An AMC certificate selects the highest MCS whose</w:t>
-      </w:r>
-      <w:r>
-        <w:t xml:space="preserve"> </w:t>
-      </w:r>
-      <w:r>
-        <w:t xml:space="preserve">required SINR the CSI clears at a given BLER target. The</w:t>
-      </w:r>
-      <w:r>
-        <w:t xml:space="preserve"> </w:t>
-      </w:r>
-      <w:r>
-        <w:rPr>
-          <w:i/>
-          <w:iCs/>
-        </w:rPr>
-        <w:t xml:space="preserve">consumer</w:t>
-      </w:r>
-      <w:r>
-        <w:t xml:space="preserve"> </w:t>
-      </w:r>
-      <w:r>
-        <w:t xml:space="preserve">is that rate</w:t>
-      </w:r>
-      <w:r>
-        <w:t xml:space="preserve"> </w:t>
-      </w:r>
-      <w:r>
-        <w:t xml:space="preserve">decision under a specific reliability target; the</w:t>
-      </w:r>
-      <w:r>
-        <w:t xml:space="preserve"> </w:t>
-      </w:r>
-      <w:r>
-        <w:rPr>
-          <w:i/>
-          <w:iCs/>
-        </w:rPr>
-        <w:t xml:space="preserve">witness</w:t>
-      </w:r>
-      <w:r>
-        <w:t xml:space="preserve"> </w:t>
-      </w:r>
-      <w:r>
-        <w:t xml:space="preserve">is the LDPC decode</w:t>
-      </w:r>
-      <w:r>
-        <w:t xml:space="preserve"> </w:t>
-      </w:r>
-      <w:r>
-        <w:t xml:space="preserve">outcome. A false-clear is a certificate that clears an MCS the witness then fails.</w:t>
-      </w:r>
-    </w:p>
-    <w:p>
-      <w:pPr>
-        <w:pStyle w:val="BodyText"/>
-      </w:pPr>
-      <w:r>
-        <w:rPr>
-          <w:b/>
-          <w:bCs/>
-        </w:rPr>
-        <w:t xml:space="preserve">Discipline.</w:t>
-      </w:r>
-      <w:r>
-        <w:t xml:space="preserve"> </w:t>
-      </w:r>
-      <w:r>
-        <w:t xml:space="preserve">Each experiment is pre-registered with numerical bars and</w:t>
-      </w:r>
-      <w:r>
-        <w:t xml:space="preserve"> </w:t>
-      </w:r>
-      <w:r>
-        <w:t xml:space="preserve">manipulation checks fixed before the graded run; the sealed record is content-hashed and</w:t>
-      </w:r>
-      <w:r>
-        <w:t xml:space="preserve"> </w:t>
-      </w:r>
-      <w:r>
-        <w:t xml:space="preserve">graded on seeds disjoint from those used to design it, and negative or failing outcomes</w:t>
-      </w:r>
-      <w:r>
-        <w:t xml:space="preserve"> </w:t>
-      </w:r>
-      <w:r>
-        <w:t xml:space="preserve">are kept </w:t>
-      </w:r>
-      <w:r>
-        <w:t xml:space="preserve">. The numbers below are the graded, sealed values.</w:t>
-      </w:r>
-    </w:p>
-    <w:bookmarkEnd w:id="10"/>
-    <w:bookmarkStart w:id="15" w:name="sec:urllc"/>
-    <w:p>
-      <w:pPr>
-        <w:pStyle w:val="Heading1"/>
-      </w:pPr>
-      <w:r>
-        <w:t xml:space="preserve">Consumer-Relativity in the Reliability Target</w:t>
-      </w:r>
-    </w:p>
-    <w:p>
-      <w:pPr>
-        <w:pStyle w:val="FirstParagraph"/>
-      </w:pPr>
-      <w:r>
-        <w:t xml:space="preserve">A base station serving mixed traffic derives one CSI estimate per user and selects an</w:t>
-      </w:r>
-      <w:r>
-        <w:t xml:space="preserve"> </w:t>
-      </w:r>
-      <w:r>
-        <w:t xml:space="preserve">MCS. Consider the same estimate consumed under two targets: eMBB</w:t>
-      </w:r>
-      <w:r>
-        <w:t xml:space="preserve"> </w:t>
-      </w:r>
-      <w:r>
-        <w:t xml:space="preserve">(</w:t>
-      </w:r>
-      <m:oMath>
-        <m:r>
-          <m:rPr>
-            <m:sty m:val="p"/>
-          </m:rPr>
-          <m:t>B</m:t>
-        </m:r>
-        <m:r>
-          <m:rPr>
-            <m:sty m:val="p"/>
-          </m:rPr>
-          <m:t>L</m:t>
-        </m:r>
-        <m:r>
-          <m:rPr>
-            <m:sty m:val="p"/>
-          </m:rPr>
-          <m:t>E</m:t>
-        </m:r>
-        <m:r>
-          <m:rPr>
-            <m:sty m:val="p"/>
-          </m:rPr>
-          <m:t>R</m:t>
-        </m:r>
-        <m:r>
-          <m:rPr>
-            <m:sty m:val="p"/>
-          </m:rPr>
-          <m:t>≤</m:t>
-        </m:r>
-        <m:sSup>
-          <m:e>
-            <m:r>
-              <m:t>10</m:t>
-            </m:r>
-          </m:e>
-          <m:sup>
-            <m:r>
-              <m:rPr>
-                <m:sty m:val="p"/>
-              </m:rPr>
-              <m:t>−</m:t>
-            </m:r>
-            <m:r>
-              <m:t>1</m:t>
-            </m:r>
-          </m:sup>
-        </m:sSup>
-      </m:oMath>
-      <w:r>
-        <w:t xml:space="preserve">) and URLLC (</w:t>
-      </w:r>
-      <m:oMath>
-        <m:r>
-          <m:rPr>
-            <m:sty m:val="p"/>
-          </m:rPr>
-          <m:t>≤</m:t>
-        </m:r>
-        <m:sSup>
-          <m:e>
-            <m:r>
-              <m:t>10</m:t>
-            </m:r>
-          </m:e>
-          <m:sup>
-            <m:r>
-              <m:rPr>
-                <m:sty m:val="p"/>
-              </m:rPr>
-              <m:t>−</m:t>
-            </m:r>
-            <m:r>
-              <m:t>3</m:t>
-            </m:r>
-          </m:sup>
-        </m:sSup>
-      </m:oMath>
-      <w:r>
-        <w:t xml:space="preserve">). We drive a real NR link at high</w:t>
-      </w:r>
-      <w:r>
-        <w:t xml:space="preserve"> </w:t>
-      </w:r>
-      <w:r>
-        <w:t xml:space="preserve">mobility, apply the naive CSI-derived MCS, and measure the achieved BLER against each</w:t>
-      </w:r>
-      <w:r>
-        <w:t xml:space="preserve"> </w:t>
-      </w:r>
-      <w:r>
-        <w:t xml:space="preserve">target; we then compare a</w:t>
-      </w:r>
-      <w:r>
-        <w:t xml:space="preserve"> </w:t>
-      </w:r>
-      <w:r>
-        <w:rPr>
-          <w:i/>
-          <w:iCs/>
-        </w:rPr>
-        <w:t xml:space="preserve">target-aware</w:t>
-      </w:r>
-      <w:r>
-        <w:t xml:space="preserve"> </w:t>
-      </w:r>
-      <w:r>
-        <w:t xml:space="preserve">policy that sizes its margin to the</w:t>
-      </w:r>
-      <w:r>
-        <w:t xml:space="preserve"> </w:t>
-      </w:r>
-      <w:r>
-        <w:t xml:space="preserve">consumer’s target.</w:t>
-      </w:r>
-    </w:p>
-    <w:p>
-      <w:pPr>
-        <w:pStyle w:val="BodyText"/>
-      </w:pPr>
-      <w:r>
-        <w:t xml:space="preserve">Figure </w:t>
-      </w:r>
-      <w:hyperlink w:anchor="fig:urllc">
+      <w:r>
+        <w:t xml:space="preserve"> </w:t>
+      </w:r>
+      <w:r>
+        <w:t xml:space="preserve">Table </w:t>
+      </w:r>
+      <w:hyperlink w:anchor="tab:params">
         <w:r>
           <w:rPr>
             <w:rStyle w:val="Hyperlink"/>
@@ -936,60 +867,31 @@
         <w:t xml:space="preserve"> </w:t>
       </w:r>
       <w:r>
-        <w:t xml:space="preserve">reports the sealed result (three graded seeds). The naive</w:t>
-      </w:r>
-      <w:r>
-        <w:t xml:space="preserve"> </w:t>
-      </w:r>
-      <w:r>
-        <w:t xml:space="preserve">certificate achieves</w:t>
-      </w:r>
-      <w:r>
-        <w:t xml:space="preserve"> </w:t>
-      </w:r>
-      <m:oMath>
-        <m:r>
-          <m:rPr>
-            <m:sty m:val="p"/>
-          </m:rPr>
-          <m:t>B</m:t>
-        </m:r>
-        <m:r>
-          <m:rPr>
-            <m:sty m:val="p"/>
-          </m:rPr>
-          <m:t>L</m:t>
-        </m:r>
-        <m:r>
-          <m:rPr>
-            <m:sty m:val="p"/>
-          </m:rPr>
-          <m:t>E</m:t>
-        </m:r>
-        <m:r>
-          <m:rPr>
-            <m:sty m:val="p"/>
-          </m:rPr>
-          <m:t>R</m:t>
-        </m:r>
-        <m:r>
-          <m:rPr>
-            <m:sty m:val="p"/>
-          </m:rPr>
-          <m:t>≈</m:t>
-        </m:r>
-        <m:r>
-          <m:t>0.112</m:t>
-        </m:r>
-      </m:oMath>
-      <w:r>
-        <w:t xml:space="preserve">. Read by the eMBB consumer this is at</w:t>
-      </w:r>
-      <w:r>
-        <w:t xml:space="preserve"> </w:t>
-      </w:r>
-      <w:r>
-        <w:t xml:space="preserve">target—the certificate is sound. Read by the URLLC consumer the</w:t>
+        <w:t xml:space="preserve">lists the parameters.</w:t>
+      </w:r>
+    </w:p>
+    <w:p>
+      <w:pPr>
+        <w:pStyle w:val="BodyText"/>
+      </w:pPr>
+      <w:r>
+        <w:rPr>
+          <w:b/>
+          <w:bCs/>
+        </w:rPr>
+        <w:t xml:space="preserve">Certificate, consumer, witness.</w:t>
+      </w:r>
+      <w:r>
+        <w:t xml:space="preserve"> </w:t>
+      </w:r>
+      <w:r>
+        <w:t xml:space="preserve">An AMC certificate selects the highest MCS whose</w:t>
+      </w:r>
+      <w:r>
+        <w:t xml:space="preserve"> </w:t>
+      </w:r>
+      <w:r>
+        <w:t xml:space="preserve">required SINR the CSI clears at a given BLER target. The</w:t>
       </w:r>
       <w:r>
         <w:t xml:space="preserve"> </w:t>
@@ -999,47 +901,148 @@
           <w:i/>
           <w:iCs/>
         </w:rPr>
-        <w:t xml:space="preserve">same</w:t>
+        <w:t xml:space="preserve">consumer</w:t>
+      </w:r>
+      <w:r>
+        <w:t xml:space="preserve"> </w:t>
+      </w:r>
+      <w:r>
+        <w:t xml:space="preserve">is that rate</w:t>
+      </w:r>
+      <w:r>
+        <w:t xml:space="preserve"> </w:t>
+      </w:r>
+      <w:r>
+        <w:t xml:space="preserve">decision under a specific reliability target; the</w:t>
+      </w:r>
+      <w:r>
+        <w:t xml:space="preserve"> </w:t>
+      </w:r>
+      <w:r>
+        <w:rPr>
+          <w:i/>
+          <w:iCs/>
+        </w:rPr>
+        <w:t xml:space="preserve">witness</w:t>
+      </w:r>
+      <w:r>
+        <w:t xml:space="preserve"> </w:t>
+      </w:r>
+      <w:r>
+        <w:t xml:space="preserve">is the LDPC decode</w:t>
+      </w:r>
+      <w:r>
+        <w:t xml:space="preserve"> </w:t>
+      </w:r>
+      <w:r>
+        <w:t xml:space="preserve">outcome. A false-clear is a certificate that clears an MCS the witness then fails.</w:t>
+      </w:r>
+    </w:p>
+    <w:p>
+      <w:pPr>
+        <w:pStyle w:val="BodyText"/>
+      </w:pPr>
+      <w:r>
+        <w:rPr>
+          <w:b/>
+          <w:bCs/>
+        </w:rPr>
+        <w:t xml:space="preserve">Policies.</w:t>
+      </w:r>
+      <w:r>
+        <w:t xml:space="preserve"> </w:t>
+      </w:r>
+      <w:r>
+        <w:t xml:space="preserve">The</w:t>
+      </w:r>
+      <w:r>
+        <w:t xml:space="preserve"> </w:t>
+      </w:r>
+      <w:r>
+        <w:rPr>
+          <w:i/>
+          <w:iCs/>
+        </w:rPr>
+        <w:t xml:space="preserve">naive</w:t>
+      </w:r>
+      <w:r>
+        <w:t xml:space="preserve"> </w:t>
+      </w:r>
+      <w:r>
+        <w:t xml:space="preserve">certificate selects the highest MCS clearing the</w:t>
+      </w:r>
+      <w:r>
+        <w:t xml:space="preserve"> </w:t>
+      </w:r>
+      <w:r>
+        <w:t xml:space="preserve">eMBB target from a (fresh or held) CQI report. The</w:t>
+      </w:r>
+      <w:r>
+        <w:t xml:space="preserve"> </w:t>
+      </w:r>
+      <w:r>
+        <w:rPr>
+          <w:i/>
+          <w:iCs/>
+        </w:rPr>
+        <w:t xml:space="preserve">target-aware</w:t>
+      </w:r>
+      <w:r>
+        <w:t xml:space="preserve"> </w:t>
+      </w:r>
+      <w:r>
+        <w:t xml:space="preserve">URLLC policy</w:t>
+      </w:r>
+      <w:r>
+        <w:t xml:space="preserve"> </w:t>
+      </w:r>
+      <w:r>
+        <w:t xml:space="preserve">selects a conservative MCS (a fixed SINR backoff)</w:t>
+      </w:r>
+      <w:r>
+        <w:t xml:space="preserve"> </w:t>
+      </w:r>
+      <w:r>
+        <w:rPr>
+          <w:i/>
+          <w:iCs/>
+        </w:rPr>
+        <w:t xml:space="preserve">and</w:t>
+      </w:r>
+      <w:r>
+        <w:t xml:space="preserve"> </w:t>
+      </w:r>
+      <w:r>
+        <w:t xml:space="preserve">uses</w:t>
       </w:r>
       <w:r>
         <w:t xml:space="preserve"> </w:t>
       </w:r>
       <m:oMath>
         <m:r>
-          <m:t>0.112</m:t>
-        </m:r>
-      </m:oMath>
-      <w:r>
-        <w:t xml:space="preserve"> </w:t>
-      </w:r>
-      <w:r>
-        <w:t xml:space="preserve">is</w:t>
-      </w:r>
-      <w:r>
-        <w:t xml:space="preserve"> </w:t>
-      </w:r>
-      <w:r>
-        <w:t xml:space="preserve">a false-clear by</w:t>
-      </w:r>
-      <w:r>
-        <w:t xml:space="preserve"> </w:t>
-      </w:r>
-      <m:oMath>
-        <m:r>
-          <m:t>112</m:t>
+          <m:t>K</m:t>
         </m:r>
         <m:r>
           <m:rPr>
             <m:sty m:val="p"/>
           </m:rPr>
-          <m:t>×</m:t>
+          <m:t>=</m:t>
+        </m:r>
+        <m:r>
+          <m:t>3</m:t>
         </m:r>
       </m:oMath>
       <w:r>
         <w:t xml:space="preserve"> </w:t>
       </w:r>
       <w:r>
-        <w:t xml:space="preserve">(against</w:t>
+        <w:t xml:space="preserve">frequency/spatial diversity branches (a block errs only if all branches err); a backoff</w:t>
+      </w:r>
+      <w:r>
+        <w:t xml:space="preserve"> </w:t>
+      </w:r>
+      <w:r>
+        <w:t xml:space="preserve">alone cannot reach a</w:t>
       </w:r>
       <w:r>
         <w:t xml:space="preserve"> </w:t>
@@ -1065,24 +1068,836 @@
         </m:sSup>
       </m:oMath>
       <w:r>
-        <w:t xml:space="preserve">): every such block is a reliability-SLA</w:t>
-      </w:r>
-      <w:r>
-        <w:t xml:space="preserve"> </w:t>
-      </w:r>
-      <w:r>
-        <w:t xml:space="preserve">violation, invisible to a scheduler that assumed one CSI report serves all traffic. The</w:t>
-      </w:r>
-      <w:r>
-        <w:t xml:space="preserve"> </w:t>
-      </w:r>
-      <w:r>
-        <w:t xml:space="preserve">target-aware policy—the same CSI, an added</w:t>
-      </w:r>
-      <w:r>
-        <w:t xml:space="preserve"> </w:t>
+        <w:t xml:space="preserve"> </w:t>
+      </w:r>
+      <w:r>
+        <w:t xml:space="preserve">tail on a single branch, so the honest URLLC certificate</w:t>
+      </w:r>
+      <w:r>
+        <w:t xml:space="preserve"> </w:t>
+      </w:r>
+      <w:r>
+        <w:t xml:space="preserve">combines both. The</w:t>
+      </w:r>
+      <w:r>
+        <w:t xml:space="preserve"> </w:t>
+      </w:r>
+      <w:r>
+        <w:rPr>
+          <w:i/>
+          <w:iCs/>
+        </w:rPr>
+        <w:t xml:space="preserve">OLLA</w:t>
+      </w:r>
+      <w:r>
+        <w:t xml:space="preserve"> </w:t>
+      </w:r>
+      <w:r>
+        <w:t xml:space="preserve">policy (§</w:t>
+      </w:r>
+      <w:hyperlink w:anchor="sec:refresh">
+        <w:r>
+          <w:rPr>
+            <w:rStyle w:val="Hyperlink"/>
+          </w:rPr>
+          <w:t xml:space="preserve">4</w:t>
+        </w:r>
+      </w:hyperlink>
+      <w:r>
+        <w:t xml:space="preserve">) adds an SINR offset driven by</w:t>
+      </w:r>
+      <w:r>
+        <w:t xml:space="preserve"> </w:t>
+      </w:r>
+      <w:r>
+        <w:t xml:space="preserve">HARQ ACK/NACK to a held report.</w:t>
+      </w:r>
+    </w:p>
+    <w:p>
+      <w:pPr>
+        <w:pStyle w:val="BodyText"/>
+      </w:pPr>
+      <w:r>
+        <w:rPr>
+          <w:b/>
+          <w:bCs/>
+        </w:rPr>
+        <w:t xml:space="preserve">Discipline.</w:t>
+      </w:r>
+      <w:r>
+        <w:t xml:space="preserve"> </w:t>
+      </w:r>
+      <w:r>
+        <w:t xml:space="preserve">Each experiment is pre-registered with numerical bars and</w:t>
+      </w:r>
+      <w:r>
+        <w:t xml:space="preserve"> </w:t>
+      </w:r>
+      <w:r>
+        <w:t xml:space="preserve">manipulation checks fixed before the graded run; the sealed record is content-hashed and</w:t>
+      </w:r>
+      <w:r>
+        <w:t xml:space="preserve"> </w:t>
+      </w:r>
+      <w:r>
+        <w:t xml:space="preserve">graded on seeds disjoint from those used to design it, and negative or failing outcomes</w:t>
+      </w:r>
+      <w:r>
+        <w:t xml:space="preserve"> </w:t>
+      </w:r>
+      <w:r>
+        <w:t xml:space="preserve">are kept </w:t>
+      </w:r>
+      <w:r>
+        <w:t xml:space="preserve">. The numbers below are the graded, sealed values</w:t>
+      </w:r>
+      <w:r>
+        <w:t xml:space="preserve"> </w:t>
+      </w:r>
+      <w:r>
+        <w:t xml:space="preserve">(Table </w:t>
+      </w:r>
+      <w:hyperlink w:anchor="tab:results">
+        <w:r>
+          <w:rPr>
+            <w:rStyle w:val="Hyperlink"/>
+          </w:rPr>
+          <w:t xml:space="preserve">2</w:t>
+        </w:r>
+      </w:hyperlink>
+      <w:r>
+        <w:t xml:space="preserve">).</w:t>
+      </w:r>
+    </w:p>
+    <w:bookmarkStart w:id="10" w:name="tab:params"/>
+    <w:p>
+      <w:pPr>
+        <w:pStyle w:val="TableCaption"/>
+      </w:pPr>
+      <w:r>
+        <w:t xml:space="preserve">Link-level parameters (sealed cells)</w:t>
+      </w:r>
+    </w:p>
+    <w:tbl>
+      <w:tblPr>
+        <w:tblStyle w:val="Table"/>
+        <w:tblW w:type="auto" w:w="0"/>
+        <w:tblLook w:firstRow="1" w:lastRow="0" w:firstColumn="0" w:lastColumn="0" w:noHBand="0" w:noVBand="0" w:val="0020"/>
+        <w:tblCaption w:val="Link-level parameters (sealed cells)"/>
+      </w:tblPr>
+      <w:tblGrid>
+        <w:gridCol w:w="3960"/>
+        <w:gridCol w:w="3960"/>
+      </w:tblGrid>
+      <w:tr>
+        <w:trPr>
+          <w:tblHeader w:val="on"/>
+        </w:trPr>
+        <w:tc>
+          <w:tcPr/>
+          <w:p>
+            <w:pPr>
+              <w:pStyle w:val="Compact"/>
+              <w:jc w:val="left"/>
+            </w:pPr>
+            <w:r>
+              <w:t xml:space="preserve">Parameter</w:t>
+            </w:r>
+          </w:p>
+        </w:tc>
+        <w:tc>
+          <w:tcPr/>
+          <w:p>
+            <w:pPr>
+              <w:pStyle w:val="Compact"/>
+              <w:jc w:val="left"/>
+            </w:pPr>
+            <w:r>
+              <w:t xml:space="preserve">Value</w:t>
+            </w:r>
+          </w:p>
+        </w:tc>
+      </w:tr>
+      <w:tr>
+        <w:tc>
+          <w:tcPr/>
+          <w:p>
+            <w:pPr>
+              <w:pStyle w:val="Compact"/>
+              <w:jc w:val="left"/>
+            </w:pPr>
+            <w:r>
+              <w:t xml:space="preserve">Carrier frequency</w:t>
+            </w:r>
+          </w:p>
+        </w:tc>
+        <w:tc>
+          <w:tcPr/>
+          <w:p>
+            <w:pPr>
+              <w:pStyle w:val="Compact"/>
+              <w:jc w:val="left"/>
+            </w:pPr>
+            <m:oMath>
+              <m:r>
+                <m:t>3.5</m:t>
+              </m:r>
+            </m:oMath>
+            <w:r>
+              <w:t xml:space="preserve"> GHz</w:t>
+            </w:r>
+          </w:p>
+        </w:tc>
+      </w:tr>
+      <w:tr>
+        <w:tc>
+          <w:tcPr/>
+          <w:p>
+            <w:pPr>
+              <w:pStyle w:val="Compact"/>
+              <w:jc w:val="left"/>
+            </w:pPr>
+            <w:r>
+              <w:t xml:space="preserve">TTI duration</w:t>
+            </w:r>
+          </w:p>
+        </w:tc>
+        <w:tc>
+          <w:tcPr/>
+          <w:p>
+            <w:pPr>
+              <w:pStyle w:val="Compact"/>
+              <w:jc w:val="left"/>
+            </w:pPr>
+            <m:oMath>
+              <m:r>
+                <m:t>1</m:t>
+              </m:r>
+            </m:oMath>
+            <w:r>
+              <w:t xml:space="preserve"> ms</w:t>
+            </w:r>
+          </w:p>
+        </w:tc>
+      </w:tr>
+      <w:tr>
+        <w:tc>
+          <w:tcPr/>
+          <w:p>
+            <w:pPr>
+              <w:pStyle w:val="Compact"/>
+              <w:jc w:val="left"/>
+            </w:pPr>
+            <w:r>
+              <w:t xml:space="preserve">Channel model</w:t>
+            </w:r>
+          </w:p>
+        </w:tc>
+        <w:tc>
+          <w:tcPr/>
+          <w:p>
+            <w:pPr>
+              <w:pStyle w:val="Compact"/>
+              <w:jc w:val="left"/>
+            </w:pPr>
+            <w:r>
+              <w:t xml:space="preserve">3GPP TR38.901 TDL-A</w:t>
+            </w:r>
+          </w:p>
+        </w:tc>
+      </w:tr>
+      <w:tr>
+        <w:tc>
+          <w:tcPr/>
+          <w:p>
+            <w:pPr>
+              <w:pStyle w:val="Compact"/>
+              <w:jc w:val="left"/>
+            </w:pPr>
+            <w:r>
+              <w:t xml:space="preserve">Mean SNR</w:t>
+            </w:r>
+          </w:p>
+        </w:tc>
+        <w:tc>
+          <w:tcPr/>
+          <w:p>
+            <w:pPr>
+              <w:pStyle w:val="Compact"/>
+              <w:jc w:val="left"/>
+            </w:pPr>
+            <m:oMath>
+              <m:r>
+                <m:t>12</m:t>
+              </m:r>
+            </m:oMath>
+            <w:r>
+              <w:t xml:space="preserve"> dB</w:t>
+            </w:r>
+          </w:p>
+        </w:tc>
+      </w:tr>
+      <w:tr>
+        <w:tc>
+          <w:tcPr/>
+          <w:p>
+            <w:pPr>
+              <w:pStyle w:val="Compact"/>
+              <w:jc w:val="left"/>
+            </w:pPr>
+            <w:r>
+              <w:t xml:space="preserve">Decoder / code</w:t>
+            </w:r>
+          </w:p>
+        </w:tc>
+        <w:tc>
+          <w:tcPr/>
+          <w:p>
+            <w:pPr>
+              <w:pStyle w:val="Compact"/>
+              <w:jc w:val="left"/>
+            </w:pPr>
+            <w:r>
+              <w:t xml:space="preserve">Sionna 5G NR LDPC (real decode)</w:t>
+            </w:r>
+          </w:p>
+        </w:tc>
+      </w:tr>
+      <w:tr>
+        <w:tc>
+          <w:tcPr/>
+          <w:p>
+            <w:pPr>
+              <w:pStyle w:val="Compact"/>
+              <w:jc w:val="left"/>
+            </w:pPr>
+            <w:r>
+              <w:t xml:space="preserve">MCS set</w:t>
+            </w:r>
+          </w:p>
+        </w:tc>
+        <w:tc>
+          <w:tcPr/>
+          <w:p>
+            <w:pPr>
+              <w:pStyle w:val="Compact"/>
+              <w:jc w:val="left"/>
+            </w:pPr>
+            <w:r>
+              <w:t xml:space="preserve">NR TS 38.214 Tbl 5.1.3.1-1 (QPSK–64QAM)</w:t>
+            </w:r>
+          </w:p>
+        </w:tc>
+      </w:tr>
+      <w:tr>
+        <w:tc>
+          <w:tcPr/>
+          <w:p>
+            <w:pPr>
+              <w:pStyle w:val="Compact"/>
+              <w:jc w:val="left"/>
+            </w:pPr>
+            <w:r>
+              <w:t xml:space="preserve">BLER curves</w:t>
+            </w:r>
+          </w:p>
+        </w:tc>
+        <w:tc>
+          <w:tcPr/>
+          <w:p>
+            <w:pPr>
+              <w:pStyle w:val="Compact"/>
+              <w:jc w:val="left"/>
+            </w:pPr>
+            <w:r>
+              <w:t xml:space="preserve">400 blocks/pt, SNR</w:t>
+            </w:r>
+            <w:r>
+              <w:t xml:space="preserve"> </w:t>
+            </w:r>
+            <m:oMath>
+              <m:r>
+                <m:rPr>
+                  <m:sty m:val="p"/>
+                </m:rPr>
+                <m:t>−</m:t>
+              </m:r>
+              <m:r>
+                <m:t>8</m:t>
+              </m:r>
+            </m:oMath>
+            <w:r>
+              <w:t xml:space="preserve">–</w:t>
+            </w:r>
+            <m:oMath>
+              <m:r>
+                <m:t>28</m:t>
+              </m:r>
+            </m:oMath>
+            <w:r>
+              <w:t xml:space="preserve"> dB @</w:t>
+            </w:r>
+            <w:r>
+              <w:t xml:space="preserve"> </w:t>
+            </w:r>
+            <m:oMath>
+              <m:r>
+                <m:t>2</m:t>
+              </m:r>
+            </m:oMath>
+            <w:r>
+              <w:t xml:space="preserve"> dB</w:t>
+            </w:r>
+          </w:p>
+        </w:tc>
+      </w:tr>
+      <w:tr>
+        <w:tc>
+          <w:tcPr/>
+          <w:p>
+            <w:pPr>
+              <w:pStyle w:val="Compact"/>
+              <w:jc w:val="left"/>
+            </w:pPr>
+            <w:r>
+              <w:t xml:space="preserve">Trace length</w:t>
+            </w:r>
+          </w:p>
+        </w:tc>
+        <w:tc>
+          <w:tcPr/>
+          <w:p>
+            <w:pPr>
+              <w:pStyle w:val="Compact"/>
+              <w:jc w:val="left"/>
+            </w:pPr>
+            <m:oMath>
+              <m:r>
+                <m:t>6000</m:t>
+              </m:r>
+            </m:oMath>
+            <w:r>
+              <w:t xml:space="preserve"> </w:t>
+            </w:r>
+            <w:r>
+              <w:t xml:space="preserve">TTI</w:t>
+            </w:r>
+          </w:p>
+        </w:tc>
+      </w:tr>
+      <w:tr>
+        <w:tc>
+          <w:tcPr/>
+          <w:p>
+            <w:pPr>
+              <w:pStyle w:val="Compact"/>
+              <w:jc w:val="left"/>
+            </w:pPr>
+            <w:r>
+              <w:t xml:space="preserve">eMBB / URLLC target</w:t>
+            </w:r>
+          </w:p>
+        </w:tc>
+        <w:tc>
+          <w:tcPr/>
+          <w:p>
+            <w:pPr>
+              <w:pStyle w:val="Compact"/>
+              <w:jc w:val="left"/>
+            </w:pPr>
+            <m:oMath>
+              <m:sSup>
+                <m:e>
+                  <m:r>
+                    <m:t>10</m:t>
+                  </m:r>
+                </m:e>
+                <m:sup>
+                  <m:r>
+                    <m:rPr>
+                      <m:sty m:val="p"/>
+                    </m:rPr>
+                    <m:t>−</m:t>
+                  </m:r>
+                  <m:r>
+                    <m:t>1</m:t>
+                  </m:r>
+                </m:sup>
+              </m:sSup>
+            </m:oMath>
+            <w:r>
+              <w:t xml:space="preserve"> </w:t>
+            </w:r>
+            <w:r>
+              <w:t xml:space="preserve">/</w:t>
+            </w:r>
+            <w:r>
+              <w:t xml:space="preserve"> </w:t>
+            </w:r>
+            <m:oMath>
+              <m:sSup>
+                <m:e>
+                  <m:r>
+                    <m:t>10</m:t>
+                  </m:r>
+                </m:e>
+                <m:sup>
+                  <m:r>
+                    <m:rPr>
+                      <m:sty m:val="p"/>
+                    </m:rPr>
+                    <m:t>−</m:t>
+                  </m:r>
+                  <m:r>
+                    <m:t>3</m:t>
+                  </m:r>
+                </m:sup>
+              </m:sSup>
+            </m:oMath>
+          </w:p>
+        </w:tc>
+      </w:tr>
+      <w:tr>
+        <w:tc>
+          <w:tcPr/>
+          <w:p>
+            <w:pPr>
+              <w:pStyle w:val="Compact"/>
+              <w:jc w:val="left"/>
+            </w:pPr>
+            <w:r>
+              <w:t xml:space="preserve">URLLC-aware policy</w:t>
+            </w:r>
+          </w:p>
+        </w:tc>
+        <w:tc>
+          <w:tcPr/>
+          <w:p>
+            <w:pPr>
+              <w:pStyle w:val="Compact"/>
+              <w:jc w:val="left"/>
+            </w:pPr>
+            <w:r>
+              <w:t xml:space="preserve">conservative MCS</w:t>
+            </w:r>
+            <w:r>
+              <w:t xml:space="preserve"> </w:t>
+            </w:r>
+            <m:oMath>
+              <m:r>
+                <m:rPr>
+                  <m:sty m:val="p"/>
+                </m:rPr>
+                <m:t>+</m:t>
+              </m:r>
+            </m:oMath>
+            <w:r>
+              <w:t xml:space="preserve"> </w:t>
+            </w:r>
+            <m:oMath>
+              <m:r>
+                <m:t>K</m:t>
+              </m:r>
+              <m:r>
+                <m:rPr>
+                  <m:sty m:val="p"/>
+                </m:rPr>
+                <m:t>=</m:t>
+              </m:r>
+              <m:r>
+                <m:t>3</m:t>
+              </m:r>
+            </m:oMath>
+            <w:r>
+              <w:t xml:space="preserve"> </w:t>
+            </w:r>
+            <w:r>
+              <w:t xml:space="preserve">diversity</w:t>
+            </w:r>
+          </w:p>
+        </w:tc>
+      </w:tr>
+      <w:tr>
+        <w:tc>
+          <w:tcPr/>
+          <w:p>
+            <w:pPr>
+              <w:pStyle w:val="Compact"/>
+              <w:jc w:val="left"/>
+            </w:pPr>
+            <w:r>
+              <w:t xml:space="preserve">Doppler (aging expt.)</w:t>
+            </w:r>
+          </w:p>
+        </w:tc>
+        <w:tc>
+          <w:tcPr/>
+          <w:p>
+            <w:pPr>
+              <w:pStyle w:val="Compact"/>
+              <w:jc w:val="left"/>
+            </w:pPr>
+            <m:oMath>
+              <m:r>
+                <m:t>200</m:t>
+              </m:r>
+            </m:oMath>
+            <w:r>
+              <w:t xml:space="preserve"> Hz (</w:t>
+            </w:r>
+            <m:oMath>
+              <m:sSub>
+                <m:e>
+                  <m:r>
+                    <m:t>T</m:t>
+                  </m:r>
+                </m:e>
+                <m:sub>
+                  <m:r>
+                    <m:rPr>
+                      <m:sty m:val="p"/>
+                    </m:rPr>
+                    <m:t>c</m:t>
+                  </m:r>
+                  <m:r>
+                    <m:rPr>
+                      <m:sty m:val="p"/>
+                    </m:rPr>
+                    <m:t>o</m:t>
+                  </m:r>
+                  <m:r>
+                    <m:rPr>
+                      <m:sty m:val="p"/>
+                    </m:rPr>
+                    <m:t>h</m:t>
+                  </m:r>
+                </m:sub>
+              </m:sSub>
+              <m:r>
+                <m:t>​</m:t>
+              </m:r>
+              <m:r>
+                <m:rPr>
+                  <m:sty m:val="p"/>
+                </m:rPr>
+                <m:t>≈</m:t>
+              </m:r>
+              <m:r>
+                <m:t>​</m:t>
+              </m:r>
+              <m:r>
+                <m:t>2.1</m:t>
+              </m:r>
+            </m:oMath>
+            <w:r>
+              <w:t xml:space="preserve"> ms)</w:t>
+            </w:r>
+          </w:p>
+        </w:tc>
+      </w:tr>
+    </w:tbl>
+    <w:bookmarkEnd w:id="10"/>
+    <w:bookmarkEnd w:id="11"/>
+    <w:bookmarkStart w:id="16" w:name="sec:urllc"/>
+    <w:p>
+      <w:pPr>
+        <w:pStyle w:val="Heading1"/>
+      </w:pPr>
+      <w:r>
+        <w:t xml:space="preserve">Consumer-Relativity in the Reliability Target</w:t>
+      </w:r>
+    </w:p>
+    <w:p>
+      <w:pPr>
+        <w:pStyle w:val="FirstParagraph"/>
+      </w:pPr>
+      <w:r>
+        <w:t xml:space="preserve">A base station serving mixed traffic derives one CSI estimate per user and selects an</w:t>
+      </w:r>
+      <w:r>
+        <w:t xml:space="preserve"> </w:t>
+      </w:r>
+      <w:r>
+        <w:t xml:space="preserve">MCS. Consider the same estimate consumed under two targets: eMBB</w:t>
+      </w:r>
+      <w:r>
+        <w:t xml:space="preserve"> </w:t>
+      </w:r>
+      <w:r>
+        <w:t xml:space="preserve">(</w:t>
       </w:r>
       <m:oMath>
+        <m:r>
+          <m:rPr>
+            <m:sty m:val="p"/>
+          </m:rPr>
+          <m:t>B</m:t>
+        </m:r>
+        <m:r>
+          <m:rPr>
+            <m:sty m:val="p"/>
+          </m:rPr>
+          <m:t>L</m:t>
+        </m:r>
+        <m:r>
+          <m:rPr>
+            <m:sty m:val="p"/>
+          </m:rPr>
+          <m:t>E</m:t>
+        </m:r>
+        <m:r>
+          <m:rPr>
+            <m:sty m:val="p"/>
+          </m:rPr>
+          <m:t>R</m:t>
+        </m:r>
+        <m:r>
+          <m:rPr>
+            <m:sty m:val="p"/>
+          </m:rPr>
+          <m:t>≤</m:t>
+        </m:r>
+        <m:sSup>
+          <m:e>
+            <m:r>
+              <m:t>10</m:t>
+            </m:r>
+          </m:e>
+          <m:sup>
+            <m:r>
+              <m:rPr>
+                <m:sty m:val="p"/>
+              </m:rPr>
+              <m:t>−</m:t>
+            </m:r>
+            <m:r>
+              <m:t>1</m:t>
+            </m:r>
+          </m:sup>
+        </m:sSup>
+      </m:oMath>
+      <w:r>
+        <w:t xml:space="preserve">) and URLLC (</w:t>
+      </w:r>
+      <m:oMath>
+        <m:r>
+          <m:rPr>
+            <m:sty m:val="p"/>
+          </m:rPr>
+          <m:t>≤</m:t>
+        </m:r>
+        <m:sSup>
+          <m:e>
+            <m:r>
+              <m:t>10</m:t>
+            </m:r>
+          </m:e>
+          <m:sup>
+            <m:r>
+              <m:rPr>
+                <m:sty m:val="p"/>
+              </m:rPr>
+              <m:t>−</m:t>
+            </m:r>
+            <m:r>
+              <m:t>3</m:t>
+            </m:r>
+          </m:sup>
+        </m:sSup>
+      </m:oMath>
+      <w:r>
+        <w:t xml:space="preserve">). We drive a real NR link at high</w:t>
+      </w:r>
+      <w:r>
+        <w:t xml:space="preserve"> </w:t>
+      </w:r>
+      <w:r>
+        <w:t xml:space="preserve">mobility, apply the naive CSI-derived MCS, and measure the achieved BLER against each</w:t>
+      </w:r>
+      <w:r>
+        <w:t xml:space="preserve"> </w:t>
+      </w:r>
+      <w:r>
+        <w:t xml:space="preserve">target; we then compare a</w:t>
+      </w:r>
+      <w:r>
+        <w:t xml:space="preserve"> </w:t>
+      </w:r>
+      <w:r>
+        <w:rPr>
+          <w:i/>
+          <w:iCs/>
+        </w:rPr>
+        <w:t xml:space="preserve">target-aware</w:t>
+      </w:r>
+      <w:r>
+        <w:t xml:space="preserve"> </w:t>
+      </w:r>
+      <w:r>
+        <w:t xml:space="preserve">policy that sizes its margin to the</w:t>
+      </w:r>
+      <w:r>
+        <w:t xml:space="preserve"> </w:t>
+      </w:r>
+      <w:r>
+        <w:t xml:space="preserve">consumer’s target.</w:t>
+      </w:r>
+    </w:p>
+    <w:p>
+      <w:pPr>
+        <w:pStyle w:val="BodyText"/>
+      </w:pPr>
+      <w:r>
+        <w:t xml:space="preserve">Figure </w:t>
+      </w:r>
+      <w:hyperlink w:anchor="fig:urllc">
+        <w:r>
+          <w:rPr>
+            <w:rStyle w:val="Hyperlink"/>
+          </w:rPr>
+          <w:t xml:space="preserve">1</w:t>
+        </w:r>
+      </w:hyperlink>
+      <w:r>
+        <w:t xml:space="preserve"> </w:t>
+      </w:r>
+      <w:r>
+        <w:t xml:space="preserve">reports the sealed result (three graded seeds). The naive</w:t>
+      </w:r>
+      <w:r>
+        <w:t xml:space="preserve"> </w:t>
+      </w:r>
+      <w:r>
+        <w:t xml:space="preserve">certificate achieves</w:t>
+      </w:r>
+      <w:r>
+        <w:t xml:space="preserve"> </w:t>
+      </w:r>
+      <m:oMath>
+        <m:r>
+          <m:rPr>
+            <m:sty m:val="p"/>
+          </m:rPr>
+          <m:t>B</m:t>
+        </m:r>
+        <m:r>
+          <m:rPr>
+            <m:sty m:val="p"/>
+          </m:rPr>
+          <m:t>L</m:t>
+        </m:r>
+        <m:r>
+          <m:rPr>
+            <m:sty m:val="p"/>
+          </m:rPr>
+          <m:t>E</m:t>
+        </m:r>
+        <m:r>
+          <m:rPr>
+            <m:sty m:val="p"/>
+          </m:rPr>
+          <m:t>R</m:t>
+        </m:r>
         <m:r>
           <m:rPr>
             <m:sty m:val="p"/>
@@ -1090,17 +1905,171 @@
           <m:t>≈</m:t>
         </m:r>
         <m:r>
-          <m:t>2</m:t>
+          <m:t>0.112</m:t>
         </m:r>
       </m:oMath>
       <w:r>
-        <w:t xml:space="preserve"> dB margin sized to the URLLC</w:t>
-      </w:r>
-      <w:r>
-        <w:t xml:space="preserve"> </w:t>
-      </w:r>
-      <w:r>
-        <w:t xml:space="preserve">target—achieves</w:t>
+        <w:t xml:space="preserve">. Read by the eMBB consumer this is at</w:t>
+      </w:r>
+      <w:r>
+        <w:t xml:space="preserve"> </w:t>
+      </w:r>
+      <w:r>
+        <w:t xml:space="preserve">target—the certificate is sound. Read by the URLLC consumer the</w:t>
+      </w:r>
+      <w:r>
+        <w:t xml:space="preserve"> </w:t>
+      </w:r>
+      <w:r>
+        <w:rPr>
+          <w:i/>
+          <w:iCs/>
+        </w:rPr>
+        <w:t xml:space="preserve">same</w:t>
+      </w:r>
+      <w:r>
+        <w:t xml:space="preserve"> </w:t>
+      </w:r>
+      <m:oMath>
+        <m:r>
+          <m:t>0.112</m:t>
+        </m:r>
+      </m:oMath>
+      <w:r>
+        <w:t xml:space="preserve"> </w:t>
+      </w:r>
+      <w:r>
+        <w:t xml:space="preserve">is</w:t>
+      </w:r>
+      <w:r>
+        <w:t xml:space="preserve"> </w:t>
+      </w:r>
+      <w:r>
+        <w:t xml:space="preserve">a false-clear by</w:t>
+      </w:r>
+      <w:r>
+        <w:t xml:space="preserve"> </w:t>
+      </w:r>
+      <m:oMath>
+        <m:r>
+          <m:t>112</m:t>
+        </m:r>
+        <m:r>
+          <m:rPr>
+            <m:sty m:val="p"/>
+          </m:rPr>
+          <m:t>×</m:t>
+        </m:r>
+      </m:oMath>
+      <w:r>
+        <w:t xml:space="preserve"> </w:t>
+      </w:r>
+      <w:r>
+        <w:t xml:space="preserve">(against</w:t>
+      </w:r>
+      <w:r>
+        <w:t xml:space="preserve"> </w:t>
+      </w:r>
+      <m:oMath>
+        <m:sSup>
+          <m:e>
+            <m:r>
+              <m:t>10</m:t>
+            </m:r>
+          </m:e>
+          <m:sup>
+            <m:r>
+              <m:rPr>
+                <m:sty m:val="p"/>
+              </m:rPr>
+              <m:t>−</m:t>
+            </m:r>
+            <m:r>
+              <m:t>3</m:t>
+            </m:r>
+          </m:sup>
+        </m:sSup>
+      </m:oMath>
+      <w:r>
+        <w:t xml:space="preserve">): every such block is a reliability-SLA</w:t>
+      </w:r>
+      <w:r>
+        <w:t xml:space="preserve"> </w:t>
+      </w:r>
+      <w:r>
+        <w:t xml:space="preserve">violation, invisible to a scheduler that assumed one CSI report serves all traffic. The</w:t>
+      </w:r>
+      <w:r>
+        <w:t xml:space="preserve"> </w:t>
+      </w:r>
+      <w:r>
+        <w:t xml:space="preserve">target-aware policy—the same CSI, a conservative MCS backoff combined with the</w:t>
+      </w:r>
+      <w:r>
+        <w:t xml:space="preserve"> </w:t>
+      </w:r>
+      <m:oMath>
+        <m:r>
+          <m:t>K</m:t>
+        </m:r>
+        <m:r>
+          <m:rPr>
+            <m:sty m:val="p"/>
+          </m:rPr>
+          <m:t>=</m:t>
+        </m:r>
+        <m:r>
+          <m:t>3</m:t>
+        </m:r>
+      </m:oMath>
+      <w:r>
+        <w:t xml:space="preserve"> </w:t>
+      </w:r>
+      <w:r>
+        <w:t xml:space="preserve">diversity branches introduced in Sec. </w:t>
+      </w:r>
+      <w:hyperlink w:anchor="sec:method">
+        <w:r>
+          <w:rPr>
+            <w:rStyle w:val="Hyperlink"/>
+          </w:rPr>
+          <w:t xml:space="preserve">2</w:t>
+        </w:r>
+      </w:hyperlink>
+      <w:r>
+        <w:t xml:space="preserve"> </w:t>
+      </w:r>
+      <w:r>
+        <w:t xml:space="preserve">(a backoff alone cannot reach the</w:t>
+      </w:r>
+      <w:r>
+        <w:t xml:space="preserve"> </w:t>
+      </w:r>
+      <m:oMath>
+        <m:sSup>
+          <m:e>
+            <m:r>
+              <m:t>10</m:t>
+            </m:r>
+          </m:e>
+          <m:sup>
+            <m:r>
+              <m:rPr>
+                <m:sty m:val="p"/>
+              </m:rPr>
+              <m:t>−</m:t>
+            </m:r>
+            <m:r>
+              <m:t>3</m:t>
+            </m:r>
+          </m:sup>
+        </m:sSup>
+      </m:oMath>
+      <w:r>
+        <w:t xml:space="preserve"> </w:t>
+      </w:r>
+      <w:r>
+        <w:t xml:space="preserve">tail on one branch)—achieves</w:t>
       </w:r>
       <w:r>
         <w:t xml:space="preserve"> </w:t>
@@ -1165,28 +2134,34 @@
         </m:sSup>
       </m:oMath>
       <w:r>
-        <w:t xml:space="preserve">, comfortably within target, at</w:t>
-      </w:r>
-      <w:r>
-        <w:t xml:space="preserve"> </w:t>
-      </w:r>
-      <w:r>
-        <w:t xml:space="preserve">the cost of that margin’s spectral efficiency. No single margin is correct for both</w:t>
-      </w:r>
-      <w:r>
-        <w:t xml:space="preserve"> </w:t>
-      </w:r>
-      <w:r>
-        <w:t xml:space="preserve">consumers: the eMBB-adequate margin fails URLLC, and the URLLC-safe margin over-provisions</w:t>
-      </w:r>
-      <w:r>
-        <w:t xml:space="preserve"> </w:t>
-      </w:r>
-      <w:r>
-        <w:t xml:space="preserve">eMBB. The false-clear rate is the number that prices the difference.</w:t>
+        <w:t xml:space="preserve">,</w:t>
+      </w:r>
+      <w:r>
+        <w:t xml:space="preserve"> </w:t>
+      </w:r>
+      <w:r>
+        <w:t xml:space="preserve">comfortably within target, at the cost of the backoff’s spectral efficiency and the</w:t>
+      </w:r>
+      <w:r>
+        <w:t xml:space="preserve"> </w:t>
+      </w:r>
+      <w:r>
+        <w:t xml:space="preserve">diversity’s resource overhead. No single certificate is correct for both consumers: the</w:t>
+      </w:r>
+      <w:r>
+        <w:t xml:space="preserve"> </w:t>
+      </w:r>
+      <w:r>
+        <w:t xml:space="preserve">eMBB-adequate one fails URLLC, and the URLLC-safe one over-provisions eMBB. The</w:t>
+      </w:r>
+      <w:r>
+        <w:t xml:space="preserve"> </w:t>
+      </w:r>
+      <w:r>
+        <w:t xml:space="preserve">false-clear rate is the number that prices the difference.</w:t>
       </w:r>
     </w:p>
-    <w:bookmarkStart w:id="14" w:name="fig:urllc"/>
+    <w:bookmarkStart w:id="15" w:name="fig:urllc"/>
     <w:p>
       <w:pPr>
         <w:pStyle w:val="CaptionedFigure"/>
@@ -1196,18 +2171,18 @@
           <wp:inline>
             <wp:extent cx="3055135" cy="2412915"/>
             <wp:effectExtent b="0" l="0" r="0" t="0"/>
-            <wp:docPr descr="" title="" id="12" name="Picture"/>
+            <wp:docPr descr="" title="" id="13" name="Picture"/>
             <a:graphic>
               <a:graphicData uri="http://schemas.openxmlformats.org/drawingml/2006/picture">
                 <pic:pic>
                   <pic:nvPicPr>
-                    <pic:cNvPr descr="urllc_relativity.png" id="13" name="Picture"/>
+                    <pic:cNvPr descr="urllc_relativity.png" id="14" name="Picture"/>
                     <pic:cNvPicPr>
                       <a:picLocks noChangeArrowheads="1" noChangeAspect="1"/>
                     </pic:cNvPicPr>
                   </pic:nvPicPr>
                   <pic:blipFill>
-                    <a:blip r:embed="rId11"/>
+                    <a:blip r:embed="rId12"/>
                     <a:stretch>
                       <a:fillRect/>
                     </a:stretch>
@@ -1337,9 +2312,9 @@
         <w:t xml:space="preserve">2 dB margin.</w:t>
       </w:r>
     </w:p>
-    <w:bookmarkEnd w:id="14"/>
     <w:bookmarkEnd w:id="15"/>
-    <w:bookmarkStart w:id="20" w:name="sec:refresh"/>
+    <w:bookmarkEnd w:id="16"/>
+    <w:bookmarkStart w:id="22" w:name="sec:refresh"/>
     <w:p>
       <w:pPr>
         <w:pStyle w:val="Heading1"/>
@@ -1823,7 +2798,7 @@
         <w:t xml:space="preserve">, not on a fixed calendar.</w:t>
       </w:r>
     </w:p>
-    <w:bookmarkStart w:id="19" w:name="fig:refresh"/>
+    <w:bookmarkStart w:id="20" w:name="fig:refresh"/>
     <w:p>
       <w:pPr>
         <w:pStyle w:val="CaptionedFigure"/>
@@ -1833,18 +2808,18 @@
           <wp:inline>
             <wp:extent cx="5334000" cy="2022089"/>
             <wp:effectExtent b="0" l="0" r="0" t="0"/>
-            <wp:docPr descr="" title="" id="17" name="Picture"/>
+            <wp:docPr descr="" title="" id="18" name="Picture"/>
             <a:graphic>
               <a:graphicData uri="http://schemas.openxmlformats.org/drawingml/2006/picture">
                 <pic:pic>
                   <pic:nvPicPr>
-                    <pic:cNvPr descr="refresh_floor.png" id="18" name="Picture"/>
+                    <pic:cNvPr descr="refresh_floor.png" id="19" name="Picture"/>
                     <pic:cNvPicPr>
                       <a:picLocks noChangeArrowheads="1" noChangeAspect="1"/>
                     </pic:cNvPicPr>
                   </pic:nvPicPr>
                   <pic:blipFill>
-                    <a:blip r:embed="rId16"/>
+                    <a:blip r:embed="rId17"/>
                     <a:stretch>
                       <a:fillRect/>
                     </a:stretch>
@@ -1964,9 +2939,751 @@
         <w:t xml:space="preserve">); at high Doppler it saturates at one TTI.</w:t>
       </w:r>
     </w:p>
-    <w:bookmarkEnd w:id="19"/>
     <w:bookmarkEnd w:id="20"/>
-    <w:bookmarkStart w:id="21" w:name="related-work"/>
+    <w:bookmarkStart w:id="21" w:name="tab:results"/>
+    <w:p>
+      <w:pPr>
+        <w:pStyle w:val="TableCaption"/>
+      </w:pPr>
+      <w:r>
+        <w:t xml:space="preserve">Sealed per-seed results (achieved BLER)</w:t>
+      </w:r>
+    </w:p>
+    <w:tbl>
+      <w:tblPr>
+        <w:tblStyle w:val="Table"/>
+        <w:tblW w:type="auto" w:w="0"/>
+        <w:tblLook w:firstRow="1" w:lastRow="0" w:firstColumn="0" w:lastColumn="0" w:noHBand="0" w:noVBand="0" w:val="0020"/>
+        <w:tblCaption w:val="Sealed per-seed results (achieved BLER)"/>
+      </w:tblPr>
+      <w:tblGrid>
+        <w:gridCol w:w="1584"/>
+        <w:gridCol w:w="1584"/>
+        <w:gridCol w:w="1584"/>
+        <w:gridCol w:w="1584"/>
+        <w:gridCol w:w="1584"/>
+      </w:tblGrid>
+      <w:tr>
+        <w:trPr>
+          <w:tblHeader w:val="on"/>
+        </w:trPr>
+        <w:tc>
+          <w:tcPr>
+            <w:gridSpan w:val="5"/>
+          </w:tcPr>
+          <w:p>
+            <w:pPr>
+              <w:pStyle w:val="Compact"/>
+              <w:jc w:val="left"/>
+            </w:pPr>
+            <w:r>
+              <w:rPr>
+                <w:i/>
+                <w:iCs/>
+              </w:rPr>
+              <w:t xml:space="preserve">(a) Reliability target</w:t>
+            </w:r>
+            <w:r>
+              <w:t xml:space="preserve"> </w:t>
+            </w:r>
+            <w:r>
+              <w:t xml:space="preserve">(§</w:t>
+            </w:r>
+            <w:hyperlink w:anchor="sec:urllc">
+              <w:r>
+                <w:rPr>
+                  <w:rStyle w:val="Hyperlink"/>
+                </w:rPr>
+                <w:t xml:space="preserve">3</w:t>
+              </w:r>
+            </w:hyperlink>
+            <w:r>
+              <w:t xml:space="preserve">), fresh CSI</w:t>
+            </w:r>
+          </w:p>
+        </w:tc>
+      </w:tr>
+      <w:tr>
+        <w:tc>
+          <w:tcPr/>
+          <w:p>
+            <w:pPr>
+              <w:pStyle w:val="Compact"/>
+              <w:jc w:val="left"/>
+            </w:pPr>
+            <w:r>
+              <w:t xml:space="preserve">seed</w:t>
+            </w:r>
+          </w:p>
+        </w:tc>
+        <w:tc>
+          <w:tcPr/>
+          <w:p>
+            <w:pPr>
+              <w:pStyle w:val="Compact"/>
+              <w:jc w:val="left"/>
+            </w:pPr>
+            <w:r>
+              <w:t xml:space="preserve">eMBB</w:t>
+            </w:r>
+          </w:p>
+        </w:tc>
+        <w:tc>
+          <w:tcPr/>
+          <w:p>
+            <w:pPr>
+              <w:pStyle w:val="Compact"/>
+              <w:jc w:val="left"/>
+            </w:pPr>
+            <w:r>
+              <w:t xml:space="preserve">URLLC-naive</w:t>
+            </w:r>
+          </w:p>
+        </w:tc>
+        <w:tc>
+          <w:tcPr/>
+          <w:p>
+            <w:pPr>
+              <w:pStyle w:val="Compact"/>
+              <w:jc w:val="left"/>
+            </w:pPr>
+            <w:r>
+              <w:t xml:space="preserve">URLLC-aware</w:t>
+            </w:r>
+          </w:p>
+        </w:tc>
+        <w:tc>
+          <w:tcPr/>
+          <w:p>
+            <w:pPr>
+              <w:pStyle w:val="Compact"/>
+            </w:pPr>
+          </w:p>
+        </w:tc>
+      </w:tr>
+      <w:tr>
+        <w:tc>
+          <w:tcPr/>
+          <w:p>
+            <w:pPr>
+              <w:pStyle w:val="Compact"/>
+              <w:jc w:val="left"/>
+            </w:pPr>
+            <w:r>
+              <w:t xml:space="preserve">20260824</w:t>
+            </w:r>
+          </w:p>
+        </w:tc>
+        <w:tc>
+          <w:tcPr/>
+          <w:p>
+            <w:pPr>
+              <w:pStyle w:val="Compact"/>
+              <w:jc w:val="left"/>
+            </w:pPr>
+            <m:oMath>
+              <m:r>
+                <m:t>0.1119</m:t>
+              </m:r>
+            </m:oMath>
+          </w:p>
+        </w:tc>
+        <w:tc>
+          <w:tcPr/>
+          <w:p>
+            <w:pPr>
+              <w:pStyle w:val="Compact"/>
+              <w:jc w:val="left"/>
+            </w:pPr>
+            <m:oMath>
+              <m:r>
+                <m:t>0.1119</m:t>
+              </m:r>
+            </m:oMath>
+          </w:p>
+        </w:tc>
+        <w:tc>
+          <w:tcPr/>
+          <w:p>
+            <w:pPr>
+              <w:pStyle w:val="Compact"/>
+              <w:jc w:val="left"/>
+            </w:pPr>
+            <m:oMath>
+              <m:r>
+                <m:t>1.7</m:t>
+              </m:r>
+              <m:r>
+                <m:rPr>
+                  <m:sty m:val="p"/>
+                </m:rPr>
+                <m:t>×</m:t>
+              </m:r>
+              <m:sSup>
+                <m:e>
+                  <m:r>
+                    <m:t>10</m:t>
+                  </m:r>
+                </m:e>
+                <m:sup>
+                  <m:r>
+                    <m:rPr>
+                      <m:sty m:val="p"/>
+                    </m:rPr>
+                    <m:t>−</m:t>
+                  </m:r>
+                  <m:r>
+                    <m:t>5</m:t>
+                  </m:r>
+                </m:sup>
+              </m:sSup>
+            </m:oMath>
+          </w:p>
+        </w:tc>
+        <w:tc>
+          <w:tcPr/>
+          <w:p>
+            <w:pPr>
+              <w:pStyle w:val="Compact"/>
+            </w:pPr>
+          </w:p>
+        </w:tc>
+      </w:tr>
+      <w:tr>
+        <w:tc>
+          <w:tcPr/>
+          <w:p>
+            <w:pPr>
+              <w:pStyle w:val="Compact"/>
+              <w:jc w:val="left"/>
+            </w:pPr>
+            <w:r>
+              <w:t xml:space="preserve">20260825</w:t>
+            </w:r>
+          </w:p>
+        </w:tc>
+        <w:tc>
+          <w:tcPr/>
+          <w:p>
+            <w:pPr>
+              <w:pStyle w:val="Compact"/>
+              <w:jc w:val="left"/>
+            </w:pPr>
+            <m:oMath>
+              <m:r>
+                <m:t>0.1103</m:t>
+              </m:r>
+            </m:oMath>
+          </w:p>
+        </w:tc>
+        <w:tc>
+          <w:tcPr/>
+          <w:p>
+            <w:pPr>
+              <w:pStyle w:val="Compact"/>
+              <w:jc w:val="left"/>
+            </w:pPr>
+            <m:oMath>
+              <m:r>
+                <m:t>0.1103</m:t>
+              </m:r>
+            </m:oMath>
+          </w:p>
+        </w:tc>
+        <w:tc>
+          <w:tcPr/>
+          <w:p>
+            <w:pPr>
+              <w:pStyle w:val="Compact"/>
+              <w:jc w:val="left"/>
+            </w:pPr>
+            <m:oMath>
+              <m:r>
+                <m:t>1.9</m:t>
+              </m:r>
+              <m:r>
+                <m:rPr>
+                  <m:sty m:val="p"/>
+                </m:rPr>
+                <m:t>×</m:t>
+              </m:r>
+              <m:sSup>
+                <m:e>
+                  <m:r>
+                    <m:t>10</m:t>
+                  </m:r>
+                </m:e>
+                <m:sup>
+                  <m:r>
+                    <m:rPr>
+                      <m:sty m:val="p"/>
+                    </m:rPr>
+                    <m:t>−</m:t>
+                  </m:r>
+                  <m:r>
+                    <m:t>5</m:t>
+                  </m:r>
+                </m:sup>
+              </m:sSup>
+            </m:oMath>
+          </w:p>
+        </w:tc>
+        <w:tc>
+          <w:tcPr/>
+          <w:p>
+            <w:pPr>
+              <w:pStyle w:val="Compact"/>
+            </w:pPr>
+          </w:p>
+        </w:tc>
+      </w:tr>
+      <w:tr>
+        <w:tc>
+          <w:tcPr/>
+          <w:p>
+            <w:pPr>
+              <w:pStyle w:val="Compact"/>
+              <w:jc w:val="left"/>
+            </w:pPr>
+            <w:r>
+              <w:t xml:space="preserve">20260826</w:t>
+            </w:r>
+          </w:p>
+        </w:tc>
+        <w:tc>
+          <w:tcPr/>
+          <w:p>
+            <w:pPr>
+              <w:pStyle w:val="Compact"/>
+              <w:jc w:val="left"/>
+            </w:pPr>
+            <m:oMath>
+              <m:r>
+                <m:t>0.1125</m:t>
+              </m:r>
+            </m:oMath>
+          </w:p>
+        </w:tc>
+        <w:tc>
+          <w:tcPr/>
+          <w:p>
+            <w:pPr>
+              <w:pStyle w:val="Compact"/>
+              <w:jc w:val="left"/>
+            </w:pPr>
+            <m:oMath>
+              <m:r>
+                <m:t>0.1125</m:t>
+              </m:r>
+            </m:oMath>
+          </w:p>
+        </w:tc>
+        <w:tc>
+          <w:tcPr/>
+          <w:p>
+            <w:pPr>
+              <w:pStyle w:val="Compact"/>
+              <w:jc w:val="left"/>
+            </w:pPr>
+            <m:oMath>
+              <m:r>
+                <m:rPr>
+                  <m:sty m:val="p"/>
+                </m:rPr>
+                <m:t>&lt;</m:t>
+              </m:r>
+              <m:sSup>
+                <m:e>
+                  <m:r>
+                    <m:t>10</m:t>
+                  </m:r>
+                </m:e>
+                <m:sup>
+                  <m:r>
+                    <m:rPr>
+                      <m:sty m:val="p"/>
+                    </m:rPr>
+                    <m:t>−</m:t>
+                  </m:r>
+                  <m:r>
+                    <m:t>5</m:t>
+                  </m:r>
+                </m:sup>
+              </m:sSup>
+            </m:oMath>
+          </w:p>
+        </w:tc>
+        <w:tc>
+          <w:tcPr/>
+          <w:p>
+            <w:pPr>
+              <w:pStyle w:val="Compact"/>
+            </w:pPr>
+          </w:p>
+        </w:tc>
+      </w:tr>
+      <w:tr>
+        <w:tc>
+          <w:tcPr>
+            <w:gridSpan w:val="5"/>
+          </w:tcPr>
+          <w:p>
+            <w:pPr>
+              <w:pStyle w:val="Compact"/>
+              <w:jc w:val="left"/>
+            </w:pPr>
+            <w:r>
+              <w:rPr>
+                <w:i/>
+                <w:iCs/>
+              </w:rPr>
+              <w:t xml:space="preserve">(b) Refresh horizon</w:t>
+            </w:r>
+            <w:r>
+              <w:t xml:space="preserve"> </w:t>
+            </w:r>
+            <w:r>
+              <w:t xml:space="preserve">(§</w:t>
+            </w:r>
+            <w:hyperlink w:anchor="sec:refresh">
+              <w:r>
+                <w:rPr>
+                  <w:rStyle w:val="Hyperlink"/>
+                </w:rPr>
+                <w:t xml:space="preserve">4</w:t>
+              </w:r>
+            </w:hyperlink>
+            <w:r>
+              <w:t xml:space="preserve">),</w:t>
+            </w:r>
+            <w:r>
+              <w:t xml:space="preserve"> </w:t>
+            </w:r>
+            <m:oMath>
+              <m:sSub>
+                <m:e>
+                  <m:r>
+                    <m:t>f</m:t>
+                  </m:r>
+                </m:e>
+                <m:sub>
+                  <m:r>
+                    <m:t>D</m:t>
+                  </m:r>
+                </m:sub>
+              </m:sSub>
+              <m:r>
+                <m:rPr>
+                  <m:sty m:val="p"/>
+                </m:rPr>
+                <m:t>=</m:t>
+              </m:r>
+              <m:r>
+                <m:t>200</m:t>
+              </m:r>
+            </m:oMath>
+            <w:r>
+              <w:t xml:space="preserve"> Hz,</w:t>
+            </w:r>
+            <w:r>
+              <w:t xml:space="preserve"> </w:t>
+            </w:r>
+            <m:oMath>
+              <m:r>
+                <m:t>20</m:t>
+              </m:r>
+            </m:oMath>
+            <w:r>
+              <w:t xml:space="preserve">-TTI</w:t>
+            </w:r>
+          </w:p>
+        </w:tc>
+      </w:tr>
+      <w:tr>
+        <w:tc>
+          <w:tcPr/>
+          <w:p>
+            <w:pPr>
+              <w:pStyle w:val="Compact"/>
+              <w:jc w:val="left"/>
+            </w:pPr>
+            <w:r>
+              <w:t xml:space="preserve">seed</w:t>
+            </w:r>
+          </w:p>
+        </w:tc>
+        <w:tc>
+          <w:tcPr/>
+          <w:p>
+            <w:pPr>
+              <w:pStyle w:val="Compact"/>
+              <w:jc w:val="left"/>
+            </w:pPr>
+            <w:r>
+              <w:t xml:space="preserve">naive</w:t>
+            </w:r>
+          </w:p>
+        </w:tc>
+        <w:tc>
+          <w:tcPr/>
+          <w:p>
+            <w:pPr>
+              <w:pStyle w:val="Compact"/>
+              <w:jc w:val="left"/>
+            </w:pPr>
+            <w:r>
+              <w:t xml:space="preserve">OLLA</w:t>
+            </w:r>
+          </w:p>
+        </w:tc>
+        <w:tc>
+          <w:tcPr/>
+          <w:p>
+            <w:pPr>
+              <w:pStyle w:val="Compact"/>
+              <w:jc w:val="left"/>
+            </w:pPr>
+            <w:r>
+              <w:t xml:space="preserve">fresh</w:t>
+            </w:r>
+          </w:p>
+        </w:tc>
+        <w:tc>
+          <w:tcPr/>
+          <w:p>
+            <w:pPr>
+              <w:pStyle w:val="Compact"/>
+              <w:jc w:val="left"/>
+            </w:pPr>
+            <w:r>
+              <w:t xml:space="preserve">CQI err</w:t>
+            </w:r>
+          </w:p>
+        </w:tc>
+      </w:tr>
+      <w:tr>
+        <w:tc>
+          <w:tcPr/>
+          <w:p>
+            <w:pPr>
+              <w:pStyle w:val="Compact"/>
+              <w:jc w:val="left"/>
+            </w:pPr>
+            <w:r>
+              <w:t xml:space="preserve">20260823</w:t>
+            </w:r>
+          </w:p>
+        </w:tc>
+        <w:tc>
+          <w:tcPr/>
+          <w:p>
+            <w:pPr>
+              <w:pStyle w:val="Compact"/>
+              <w:jc w:val="left"/>
+            </w:pPr>
+            <m:oMath>
+              <m:r>
+                <m:t>0.366</m:t>
+              </m:r>
+            </m:oMath>
+          </w:p>
+        </w:tc>
+        <w:tc>
+          <w:tcPr/>
+          <w:p>
+            <w:pPr>
+              <w:pStyle w:val="Compact"/>
+              <w:jc w:val="left"/>
+            </w:pPr>
+            <m:oMath>
+              <m:r>
+                <m:t>0.101</m:t>
+              </m:r>
+            </m:oMath>
+          </w:p>
+        </w:tc>
+        <w:tc>
+          <w:tcPr/>
+          <w:p>
+            <w:pPr>
+              <w:pStyle w:val="Compact"/>
+              <w:jc w:val="left"/>
+            </w:pPr>
+            <m:oMath>
+              <m:r>
+                <m:t>0.116</m:t>
+              </m:r>
+            </m:oMath>
+          </w:p>
+        </w:tc>
+        <w:tc>
+          <w:tcPr/>
+          <w:p>
+            <w:pPr>
+              <w:pStyle w:val="Compact"/>
+              <w:jc w:val="left"/>
+            </w:pPr>
+            <m:oMath>
+              <m:r>
+                <m:t>5.61</m:t>
+              </m:r>
+            </m:oMath>
+            <w:r>
+              <w:t xml:space="preserve"> dB</w:t>
+            </w:r>
+          </w:p>
+        </w:tc>
+      </w:tr>
+      <w:tr>
+        <w:tc>
+          <w:tcPr/>
+          <w:p>
+            <w:pPr>
+              <w:pStyle w:val="Compact"/>
+              <w:jc w:val="left"/>
+            </w:pPr>
+            <w:r>
+              <w:t xml:space="preserve">20260824</w:t>
+            </w:r>
+          </w:p>
+        </w:tc>
+        <w:tc>
+          <w:tcPr/>
+          <w:p>
+            <w:pPr>
+              <w:pStyle w:val="Compact"/>
+              <w:jc w:val="left"/>
+            </w:pPr>
+            <m:oMath>
+              <m:r>
+                <m:t>0.340</m:t>
+              </m:r>
+            </m:oMath>
+          </w:p>
+        </w:tc>
+        <w:tc>
+          <w:tcPr/>
+          <w:p>
+            <w:pPr>
+              <w:pStyle w:val="Compact"/>
+              <w:jc w:val="left"/>
+            </w:pPr>
+            <m:oMath>
+              <m:r>
+                <m:t>0.102</m:t>
+              </m:r>
+            </m:oMath>
+          </w:p>
+        </w:tc>
+        <w:tc>
+          <w:tcPr/>
+          <w:p>
+            <w:pPr>
+              <w:pStyle w:val="Compact"/>
+              <w:jc w:val="left"/>
+            </w:pPr>
+            <m:oMath>
+              <m:r>
+                <m:t>0.115</m:t>
+              </m:r>
+            </m:oMath>
+          </w:p>
+        </w:tc>
+        <w:tc>
+          <w:tcPr/>
+          <w:p>
+            <w:pPr>
+              <w:pStyle w:val="Compact"/>
+              <w:jc w:val="left"/>
+            </w:pPr>
+            <m:oMath>
+              <m:r>
+                <m:t>5.86</m:t>
+              </m:r>
+            </m:oMath>
+            <w:r>
+              <w:t xml:space="preserve"> dB</w:t>
+            </w:r>
+          </w:p>
+        </w:tc>
+      </w:tr>
+      <w:tr>
+        <w:tc>
+          <w:tcPr/>
+          <w:p>
+            <w:pPr>
+              <w:pStyle w:val="Compact"/>
+              <w:jc w:val="left"/>
+            </w:pPr>
+            <w:r>
+              <w:t xml:space="preserve">20260825</w:t>
+            </w:r>
+          </w:p>
+        </w:tc>
+        <w:tc>
+          <w:tcPr/>
+          <w:p>
+            <w:pPr>
+              <w:pStyle w:val="Compact"/>
+              <w:jc w:val="left"/>
+            </w:pPr>
+            <m:oMath>
+              <m:r>
+                <m:t>0.373</m:t>
+              </m:r>
+            </m:oMath>
+          </w:p>
+        </w:tc>
+        <w:tc>
+          <w:tcPr/>
+          <w:p>
+            <w:pPr>
+              <w:pStyle w:val="Compact"/>
+              <w:jc w:val="left"/>
+            </w:pPr>
+            <m:oMath>
+              <m:r>
+                <m:t>0.101</m:t>
+              </m:r>
+            </m:oMath>
+          </w:p>
+        </w:tc>
+        <w:tc>
+          <w:tcPr/>
+          <w:p>
+            <w:pPr>
+              <w:pStyle w:val="Compact"/>
+              <w:jc w:val="left"/>
+            </w:pPr>
+            <m:oMath>
+              <m:r>
+                <m:t>0.113</m:t>
+              </m:r>
+            </m:oMath>
+          </w:p>
+        </w:tc>
+        <w:tc>
+          <w:tcPr/>
+          <w:p>
+            <w:pPr>
+              <w:pStyle w:val="Compact"/>
+              <w:jc w:val="left"/>
+            </w:pPr>
+            <m:oMath>
+              <m:r>
+                <m:t>5.76</m:t>
+              </m:r>
+            </m:oMath>
+            <w:r>
+              <w:t xml:space="preserve"> dB</w:t>
+            </w:r>
+          </w:p>
+        </w:tc>
+      </w:tr>
+    </w:tbl>
+    <w:bookmarkEnd w:id="21"/>
+    <w:bookmarkEnd w:id="22"/>
+    <w:bookmarkStart w:id="23" w:name="related-work"/>
     <w:p>
       <w:pPr>
         <w:pStyle w:val="Heading1"/>
@@ -2082,8 +3799,8 @@
         <w:t xml:space="preserve">KPI—and the two relativities and the refresh law it exposes.</w:t>
       </w:r>
     </w:p>
-    <w:bookmarkEnd w:id="21"/>
-    <w:bookmarkStart w:id="23" w:name="discussion-and-conclusion"/>
+    <w:bookmarkEnd w:id="23"/>
+    <w:bookmarkStart w:id="25" w:name="discussion-and-conclusion"/>
     <w:p>
       <w:pPr>
         <w:pStyle w:val="Heading1"/>
@@ -2353,7 +4070,7 @@
       <w:r>
         <w:t xml:space="preserve"> </w:t>
       </w:r>
-      <w:hyperlink r:id="rId22">
+      <w:hyperlink r:id="rId24">
         <w:r>
           <w:rPr>
             <w:rStyle w:val="Hyperlink"/>
@@ -2365,7 +4082,7 @@
         <w:t xml:space="preserve">, 2026.</w:t>
       </w:r>
     </w:p>
-    <w:bookmarkEnd w:id="23"/>
+    <w:bookmarkEnd w:id="25"/>
     <w:sectPr>
       <w:footnotePr>
         <w:numRestart w:val="eachSect"/>

</xml_diff>

<commit_message>
WCNC: verify + correct references (vol/no/pages)
Verified all four against source records:
  Durisi/Koch/Popovski -> Proc. IEEE 104(9):1711-1726, 2016  [correct as written]
  Wen/Shih/Jin -> IEEE Wireless Commun. Lett. 7(5):748-751, 2018  [correct as written]
  Hoydis et al. Sionna -> arXiv:2203.11854, 2022  [correct as written]
  Sampath/Sarath Kumar/Holtzman OLLA -> IEEE VTC'97, vol. 2, pp. 929-933  [FIXED:
    was 'P. S. Kumar' (should be P. Sarath Kumar); added vol. 2 + full VTC name]

Co-Authored-By: Claude Opus 4.8 <noreply@anthropic.com>
</commit_message>
<xml_diff>
--- a/paper/wcnc-csi/wcnc-csi.docx
+++ b/paper/wcnc-csi/wcnc-csi.docx
@@ -3905,7 +3905,7 @@
         <w:t xml:space="preserve"> </w:t>
       </w:r>
       <w:r>
-        <w:t xml:space="preserve">A. Sampath, P. S. Kumar, and J. M. Holtzman,</w:t>
+        <w:t xml:space="preserve">A. Sampath, P. Sarath Kumar, and J. M. Holtzman,</w:t>
       </w:r>
       <w:r>
         <w:t xml:space="preserve"> </w:t>
@@ -3933,10 +3933,16 @@
           <w:i/>
           <w:iCs/>
         </w:rPr>
-        <w:t xml:space="preserve">Proc. IEEE VTC</w:t>
-      </w:r>
-      <w:r>
-        <w:t xml:space="preserve">, 1997, pp. 929–933.</w:t>
+        <w:t xml:space="preserve">Proc. IEEE 47th Veh. Technol. Conf. (VTC)</w:t>
+      </w:r>
+      <w:r>
+        <w:t xml:space="preserve">,</w:t>
+      </w:r>
+      <w:r>
+        <w:t xml:space="preserve"> </w:t>
+      </w:r>
+      <w:r>
+        <w:t xml:space="preserve">vol. 2, 1997, pp. 929–933.</w:t>
       </w:r>
       <w:r>
         <w:t xml:space="preserve"> </w:t>

</xml_diff>

<commit_message>
WCNC: add formal system-model subsection (Sec II)
Formalize the certificate/consumer/witness/false-clear, grounded in the sealed cell code:
  (1) certificate m*(g_hat) = argmax MCS with required-SNR + backoff <= estimate;
  (2) consumer-relative false-clear FC(beta) = time-avg witnessed BLER of m* at true SNR,
      read against target beta -> one trace, different verdicts for eMBB vs URLLC;
      URLLC-aware = raised backoff + K-branch diversity product;
  (3) OLLA offset update o(t+1)=o(t)+mu*(1[NACK]-beta); refresh floor P*(fD)=max{P:FC<=beta}.
Fresh vs held CSI (aging) defined via report period P. Wired eqrefs into Secs III-IV.
Rebuilt PDF (IEEEtran) + DOCX; refs resolve clean.

Co-Authored-By: Claude Opus 4.8 <noreply@anthropic.com>
</commit_message>
<xml_diff>
--- a/paper/wcnc-csi/wcnc-csi.docx
+++ b/paper/wcnc-csi/wcnc-csi.docx
@@ -879,19 +879,883 @@
           <w:b/>
           <w:bCs/>
         </w:rPr>
-        <w:t xml:space="preserve">Certificate, consumer, witness.</w:t>
-      </w:r>
-      <w:r>
-        <w:t xml:space="preserve"> </w:t>
-      </w:r>
-      <w:r>
-        <w:t xml:space="preserve">An AMC certificate selects the highest MCS whose</w:t>
-      </w:r>
-      <w:r>
-        <w:t xml:space="preserve"> </w:t>
-      </w:r>
-      <w:r>
-        <w:t xml:space="preserve">required SINR the CSI clears at a given BLER target. The</w:t>
+        <w:t xml:space="preserve">System model.</w:t>
+      </w:r>
+      <w:r>
+        <w:t xml:space="preserve"> </w:t>
+      </w:r>
+      <w:r>
+        <w:t xml:space="preserve">Let</w:t>
+      </w:r>
+      <w:r>
+        <w:t xml:space="preserve"> </w:t>
+      </w:r>
+      <m:oMath>
+        <m:r>
+          <m:t>γ</m:t>
+        </m:r>
+        <m:r>
+          <m:rPr>
+            <m:sty m:val="p"/>
+          </m:rPr>
+          <m:t>(</m:t>
+        </m:r>
+        <m:r>
+          <m:t>t</m:t>
+        </m:r>
+        <m:r>
+          <m:rPr>
+            <m:sty m:val="p"/>
+          </m:rPr>
+          <m:t>)</m:t>
+        </m:r>
+      </m:oMath>
+      <w:r>
+        <w:t xml:space="preserve"> </w:t>
+      </w:r>
+      <w:r>
+        <w:t xml:space="preserve">(dB) be the true post-processing SNR at TTI</w:t>
+      </w:r>
+      <w:r>
+        <w:t xml:space="preserve"> </w:t>
+      </w:r>
+      <m:oMath>
+        <m:r>
+          <m:t>t</m:t>
+        </m:r>
+      </m:oMath>
+      <w:r>
+        <w:t xml:space="preserve"> </w:t>
+      </w:r>
+      <w:r>
+        <w:t xml:space="preserve">and</w:t>
+      </w:r>
+      <w:r>
+        <w:t xml:space="preserve"> </w:t>
+      </w:r>
+      <m:oMath>
+        <m:acc>
+          <m:accPr>
+            <m:chr m:val="̂"/>
+          </m:accPr>
+          <m:e>
+            <m:r>
+              <m:t>g</m:t>
+            </m:r>
+          </m:e>
+        </m:acc>
+        <m:r>
+          <m:rPr>
+            <m:sty m:val="p"/>
+          </m:rPr>
+          <m:t>(</m:t>
+        </m:r>
+        <m:r>
+          <m:t>t</m:t>
+        </m:r>
+        <m:r>
+          <m:rPr>
+            <m:sty m:val="p"/>
+          </m:rPr>
+          <m:t>)</m:t>
+        </m:r>
+      </m:oMath>
+      <w:r>
+        <w:t xml:space="preserve"> </w:t>
+      </w:r>
+      <w:r>
+        <w:t xml:space="preserve">the SNR the transmitter infers from the CSI report: for</w:t>
+      </w:r>
+      <w:r>
+        <w:t xml:space="preserve"> </w:t>
+      </w:r>
+      <w:r>
+        <w:rPr>
+          <w:i/>
+          <w:iCs/>
+        </w:rPr>
+        <w:t xml:space="preserve">fresh</w:t>
+      </w:r>
+      <w:r>
+        <w:t xml:space="preserve"> </w:t>
+      </w:r>
+      <w:r>
+        <w:t xml:space="preserve">CSI</w:t>
+      </w:r>
+      <w:r>
+        <w:t xml:space="preserve"> </w:t>
+      </w:r>
+      <m:oMath>
+        <m:acc>
+          <m:accPr>
+            <m:chr m:val="̂"/>
+          </m:accPr>
+          <m:e>
+            <m:r>
+              <m:t>g</m:t>
+            </m:r>
+          </m:e>
+        </m:acc>
+        <m:r>
+          <m:rPr>
+            <m:sty m:val="p"/>
+          </m:rPr>
+          <m:t>(</m:t>
+        </m:r>
+        <m:r>
+          <m:t>t</m:t>
+        </m:r>
+        <m:r>
+          <m:rPr>
+            <m:sty m:val="p"/>
+          </m:rPr>
+          <m:t>)</m:t>
+        </m:r>
+        <m:r>
+          <m:rPr>
+            <m:sty m:val="p"/>
+          </m:rPr>
+          <m:t>=</m:t>
+        </m:r>
+        <m:r>
+          <m:t>γ</m:t>
+        </m:r>
+        <m:r>
+          <m:rPr>
+            <m:sty m:val="p"/>
+          </m:rPr>
+          <m:t>(</m:t>
+        </m:r>
+        <m:r>
+          <m:t>t</m:t>
+        </m:r>
+        <m:r>
+          <m:rPr>
+            <m:sty m:val="p"/>
+          </m:rPr>
+          <m:t>)</m:t>
+        </m:r>
+        <m:r>
+          <m:rPr>
+            <m:sty m:val="p"/>
+          </m:rPr>
+          <m:t>+</m:t>
+        </m:r>
+        <m:r>
+          <m:t>n</m:t>
+        </m:r>
+        <m:r>
+          <m:rPr>
+            <m:sty m:val="p"/>
+          </m:rPr>
+          <m:t>(</m:t>
+        </m:r>
+        <m:r>
+          <m:t>t</m:t>
+        </m:r>
+        <m:r>
+          <m:rPr>
+            <m:sty m:val="p"/>
+          </m:rPr>
+          <m:t>)</m:t>
+        </m:r>
+      </m:oMath>
+      <w:r>
+        <w:t xml:space="preserve"> </w:t>
+      </w:r>
+      <w:r>
+        <w:t xml:space="preserve">with report noise</w:t>
+      </w:r>
+      <w:r>
+        <w:t xml:space="preserve"> </w:t>
+      </w:r>
+      <m:oMath>
+        <m:r>
+          <m:t>n</m:t>
+        </m:r>
+        <m:r>
+          <m:rPr>
+            <m:sty m:val="p"/>
+          </m:rPr>
+          <m:t>∼</m:t>
+        </m:r>
+        <m:r>
+          <m:rPr>
+            <m:scr m:val="script"/>
+            <m:sty m:val="p"/>
+          </m:rPr>
+          <m:t>N</m:t>
+        </m:r>
+        <m:r>
+          <m:rPr>
+            <m:sty m:val="p"/>
+          </m:rPr>
+          <m:t>(</m:t>
+        </m:r>
+        <m:r>
+          <m:t>0</m:t>
+        </m:r>
+        <m:r>
+          <m:rPr>
+            <m:sty m:val="p"/>
+          </m:rPr>
+          <m:t>,</m:t>
+        </m:r>
+        <m:sSup>
+          <m:e>
+            <m:r>
+              <m:t>σ</m:t>
+            </m:r>
+          </m:e>
+          <m:sup>
+            <m:r>
+              <m:t>2</m:t>
+            </m:r>
+          </m:sup>
+        </m:sSup>
+        <m:r>
+          <m:rPr>
+            <m:sty m:val="p"/>
+          </m:rPr>
+          <m:t>)</m:t>
+        </m:r>
+      </m:oMath>
+      <w:r>
+        <w:t xml:space="preserve">; for a report</w:t>
+      </w:r>
+      <w:r>
+        <w:t xml:space="preserve"> </w:t>
+      </w:r>
+      <w:r>
+        <w:rPr>
+          <w:i/>
+          <w:iCs/>
+        </w:rPr>
+        <w:t xml:space="preserve">held</w:t>
+      </w:r>
+      <w:r>
+        <w:t xml:space="preserve"> </w:t>
+      </w:r>
+      <w:r>
+        <w:t xml:space="preserve">with period</w:t>
+      </w:r>
+      <w:r>
+        <w:t xml:space="preserve"> </w:t>
+      </w:r>
+      <m:oMath>
+        <m:r>
+          <m:t>P</m:t>
+        </m:r>
+      </m:oMath>
+      <w:r>
+        <w:t xml:space="preserve">,</w:t>
+      </w:r>
+      <w:r>
+        <w:t xml:space="preserve"> </w:t>
+      </w:r>
+      <m:oMath>
+        <m:acc>
+          <m:accPr>
+            <m:chr m:val="̂"/>
+          </m:accPr>
+          <m:e>
+            <m:r>
+              <m:t>g</m:t>
+            </m:r>
+          </m:e>
+        </m:acc>
+        <m:r>
+          <m:rPr>
+            <m:sty m:val="p"/>
+          </m:rPr>
+          <m:t>(</m:t>
+        </m:r>
+        <m:r>
+          <m:t>t</m:t>
+        </m:r>
+        <m:r>
+          <m:rPr>
+            <m:sty m:val="p"/>
+          </m:rPr>
+          <m:t>)</m:t>
+        </m:r>
+        <m:r>
+          <m:rPr>
+            <m:sty m:val="p"/>
+          </m:rPr>
+          <m:t>=</m:t>
+        </m:r>
+        <m:r>
+          <m:t>γ</m:t>
+        </m:r>
+        <m:r>
+          <m:t>​</m:t>
+        </m:r>
+        <m:d>
+          <m:dPr>
+            <m:begChr m:val="("/>
+            <m:sepChr m:val=""/>
+            <m:endChr m:val=")"/>
+            <m:grow/>
+          </m:dPr>
+          <m:e>
+            <m:r>
+              <m:t>P</m:t>
+            </m:r>
+            <m:r>
+              <m:rPr>
+                <m:sty m:val="p"/>
+              </m:rPr>
+              <m:t>⌊</m:t>
+            </m:r>
+            <m:r>
+              <m:t>t</m:t>
+            </m:r>
+            <m:r>
+              <m:rPr>
+                <m:sty m:val="p"/>
+              </m:rPr>
+              <m:t>/</m:t>
+            </m:r>
+            <m:r>
+              <m:t>P</m:t>
+            </m:r>
+            <m:r>
+              <m:rPr>
+                <m:sty m:val="p"/>
+              </m:rPr>
+              <m:t>⌋</m:t>
+            </m:r>
+          </m:e>
+        </m:d>
+      </m:oMath>
+      <w:r>
+        <w:t xml:space="preserve">, so the</w:t>
+      </w:r>
+      <w:r>
+        <w:t xml:space="preserve"> </w:t>
+      </w:r>
+      <w:r>
+        <w:t xml:space="preserve">estimate ages between reports. With MCS set</w:t>
+      </w:r>
+      <w:r>
+        <w:t xml:space="preserve"> </w:t>
+      </w:r>
+      <m:oMath>
+        <m:r>
+          <m:rPr>
+            <m:scr m:val="script"/>
+            <m:sty m:val="p"/>
+          </m:rPr>
+          <m:t>M</m:t>
+        </m:r>
+        <m:r>
+          <m:rPr>
+            <m:sty m:val="p"/>
+          </m:rPr>
+          <m:t>=</m:t>
+        </m:r>
+        <m:r>
+          <m:rPr>
+            <m:sty m:val="p"/>
+          </m:rPr>
+          <m:t>{</m:t>
+        </m:r>
+        <m:r>
+          <m:rPr>
+            <m:sty m:val="p"/>
+          </m:rPr>
+          <m:t>(</m:t>
+        </m:r>
+        <m:sSub>
+          <m:e>
+            <m:r>
+              <m:t>Q</m:t>
+            </m:r>
+          </m:e>
+          <m:sub>
+            <m:r>
+              <m:t>m</m:t>
+            </m:r>
+          </m:sub>
+        </m:sSub>
+        <m:r>
+          <m:rPr>
+            <m:sty m:val="p"/>
+          </m:rPr>
+          <m:t>,</m:t>
+        </m:r>
+        <m:sSub>
+          <m:e>
+            <m:r>
+              <m:t>R</m:t>
+            </m:r>
+          </m:e>
+          <m:sub>
+            <m:r>
+              <m:t>m</m:t>
+            </m:r>
+          </m:sub>
+        </m:sSub>
+        <m:r>
+          <m:rPr>
+            <m:sty m:val="p"/>
+          </m:rPr>
+          <m:t>)</m:t>
+        </m:r>
+        <m:r>
+          <m:rPr>
+            <m:sty m:val="p"/>
+          </m:rPr>
+          <m:t>}</m:t>
+        </m:r>
+      </m:oMath>
+      <w:r>
+        <w:t xml:space="preserve"> </w:t>
+      </w:r>
+      <w:r>
+        <w:t xml:space="preserve">and measured LDPC</w:t>
+      </w:r>
+      <w:r>
+        <w:t xml:space="preserve"> </w:t>
+      </w:r>
+      <w:r>
+        <w:t xml:space="preserve">error curve</w:t>
+      </w:r>
+      <w:r>
+        <w:t xml:space="preserve"> </w:t>
+      </w:r>
+      <m:oMath>
+        <m:sSub>
+          <m:e>
+            <m:r>
+              <m:t>e</m:t>
+            </m:r>
+          </m:e>
+          <m:sub>
+            <m:r>
+              <m:t>m</m:t>
+            </m:r>
+          </m:sub>
+        </m:sSub>
+        <m:r>
+          <m:rPr>
+            <m:sty m:val="p"/>
+          </m:rPr>
+          <m:t>(</m:t>
+        </m:r>
+        <m:r>
+          <m:t>γ</m:t>
+        </m:r>
+        <m:r>
+          <m:rPr>
+            <m:sty m:val="p"/>
+          </m:rPr>
+          <m:t>)</m:t>
+        </m:r>
+      </m:oMath>
+      <w:r>
+        <w:t xml:space="preserve">, the required SNR at target</w:t>
+      </w:r>
+      <w:r>
+        <w:t xml:space="preserve"> </w:t>
+      </w:r>
+      <m:oMath>
+        <m:r>
+          <m:t>β</m:t>
+        </m:r>
+      </m:oMath>
+      <w:r>
+        <w:t xml:space="preserve"> </w:t>
+      </w:r>
+      <w:r>
+        <w:t xml:space="preserve">is</w:t>
+      </w:r>
+      <w:r>
+        <w:t xml:space="preserve"> </w:t>
+      </w:r>
+      <m:oMath>
+        <m:sSub>
+          <m:e>
+            <m:r>
+              <m:t>ρ</m:t>
+            </m:r>
+          </m:e>
+          <m:sub>
+            <m:r>
+              <m:t>m</m:t>
+            </m:r>
+          </m:sub>
+        </m:sSub>
+        <m:r>
+          <m:rPr>
+            <m:sty m:val="p"/>
+          </m:rPr>
+          <m:t>(</m:t>
+        </m:r>
+        <m:r>
+          <m:t>β</m:t>
+        </m:r>
+        <m:r>
+          <m:rPr>
+            <m:sty m:val="p"/>
+          </m:rPr>
+          <m:t>)</m:t>
+        </m:r>
+        <m:r>
+          <m:rPr>
+            <m:sty m:val="p"/>
+          </m:rPr>
+          <m:t>=</m:t>
+        </m:r>
+        <m:r>
+          <m:rPr>
+            <m:sty m:val="p"/>
+          </m:rPr>
+          <m:t>min</m:t>
+        </m:r>
+        <m:r>
+          <m:rPr>
+            <m:sty m:val="p"/>
+          </m:rPr>
+          <m:t>{</m:t>
+        </m:r>
+        <m:r>
+          <m:t>γ</m:t>
+        </m:r>
+        <m:r>
+          <m:rPr>
+            <m:sty m:val="p"/>
+          </m:rPr>
+          <m:t>:</m:t>
+        </m:r>
+        <m:sSub>
+          <m:e>
+            <m:r>
+              <m:t>e</m:t>
+            </m:r>
+          </m:e>
+          <m:sub>
+            <m:r>
+              <m:t>m</m:t>
+            </m:r>
+          </m:sub>
+        </m:sSub>
+        <m:r>
+          <m:rPr>
+            <m:sty m:val="p"/>
+          </m:rPr>
+          <m:t>(</m:t>
+        </m:r>
+        <m:r>
+          <m:t>γ</m:t>
+        </m:r>
+        <m:r>
+          <m:rPr>
+            <m:sty m:val="p"/>
+          </m:rPr>
+          <m:t>)</m:t>
+        </m:r>
+        <m:r>
+          <m:rPr>
+            <m:sty m:val="p"/>
+          </m:rPr>
+          <m:t>≤</m:t>
+        </m:r>
+        <m:r>
+          <m:t>β</m:t>
+        </m:r>
+        <m:r>
+          <m:rPr>
+            <m:sty m:val="p"/>
+          </m:rPr>
+          <m:t>}</m:t>
+        </m:r>
+      </m:oMath>
+      <w:r>
+        <w:t xml:space="preserve">. The AMC</w:t>
+      </w:r>
+      <w:r>
+        <w:t xml:space="preserve"> </w:t>
+      </w:r>
+      <w:r>
+        <w:rPr>
+          <w:i/>
+          <w:iCs/>
+        </w:rPr>
+        <w:t xml:space="preserve">certificate</w:t>
+      </w:r>
+      <w:r>
+        <w:t xml:space="preserve"> </w:t>
+      </w:r>
+      <w:r>
+        <w:t xml:space="preserve">selects the</w:t>
+      </w:r>
+      <w:r>
+        <w:t xml:space="preserve"> </w:t>
+      </w:r>
+      <w:r>
+        <w:t xml:space="preserve">highest MCS clearing the estimate under a backoff</w:t>
+      </w:r>
+      <w:r>
+        <w:t xml:space="preserve"> </w:t>
+      </w:r>
+      <m:oMath>
+        <m:r>
+          <m:rPr>
+            <m:sty m:val="p"/>
+          </m:rPr>
+          <m:t>Δ</m:t>
+        </m:r>
+      </m:oMath>
+      <w:r>
+        <w:t xml:space="preserve">:</w:t>
+      </w:r>
+    </w:p>
+    <w:p>
+      <w:pPr>
+        <w:pStyle w:val="BodyText"/>
+      </w:pPr>
+      <m:oMathPara>
+        <m:oMathParaPr>
+          <m:jc m:val="center"/>
+        </m:oMathParaPr>
+        <m:oMath>
+          <m:sSup>
+            <m:e>
+              <m:r>
+                <m:t>m</m:t>
+              </m:r>
+            </m:e>
+            <m:sup>
+              <m:r>
+                <m:rPr>
+                  <m:sty m:val="p"/>
+                </m:rPr>
+                <m:t>⋆</m:t>
+              </m:r>
+            </m:sup>
+          </m:sSup>
+          <m:r>
+            <m:rPr>
+              <m:sty m:val="p"/>
+            </m:rPr>
+            <m:t>(</m:t>
+          </m:r>
+          <m:acc>
+            <m:accPr>
+              <m:chr m:val="̂"/>
+            </m:accPr>
+            <m:e>
+              <m:r>
+                <m:t>g</m:t>
+              </m:r>
+            </m:e>
+          </m:acc>
+          <m:r>
+            <m:rPr>
+              <m:sty m:val="p"/>
+            </m:rPr>
+            <m:t>)</m:t>
+          </m:r>
+          <m:r>
+            <m:rPr>
+              <m:sty m:val="p"/>
+            </m:rPr>
+            <m:t>=</m:t>
+          </m:r>
+          <m:r>
+            <m:rPr>
+              <m:sty m:val="p"/>
+            </m:rPr>
+            <m:t>max</m:t>
+          </m:r>
+          <m:r>
+            <m:rPr>
+              <m:sty m:val="p"/>
+            </m:rPr>
+            <m:t>{</m:t>
+          </m:r>
+          <m:r>
+            <m:t>m</m:t>
+          </m:r>
+          <m:r>
+            <m:rPr>
+              <m:sty m:val="p"/>
+            </m:rPr>
+            <m:t>∈</m:t>
+          </m:r>
+          <m:r>
+            <m:rPr>
+              <m:scr m:val="script"/>
+              <m:sty m:val="p"/>
+            </m:rPr>
+            <m:t>M</m:t>
+          </m:r>
+          <m:r>
+            <m:rPr>
+              <m:sty m:val="p"/>
+            </m:rPr>
+            <m:t>:</m:t>
+          </m:r>
+          <m:sSub>
+            <m:e>
+              <m:r>
+                <m:t>ρ</m:t>
+              </m:r>
+            </m:e>
+            <m:sub>
+              <m:r>
+                <m:t>m</m:t>
+              </m:r>
+            </m:sub>
+          </m:sSub>
+          <m:r>
+            <m:rPr>
+              <m:sty m:val="p"/>
+            </m:rPr>
+            <m:t>(</m:t>
+          </m:r>
+          <m:sSub>
+            <m:e>
+              <m:r>
+                <m:t>β</m:t>
+              </m:r>
+            </m:e>
+            <m:sub>
+              <m:r>
+                <m:t>0</m:t>
+              </m:r>
+            </m:sub>
+          </m:sSub>
+          <m:r>
+            <m:rPr>
+              <m:sty m:val="p"/>
+            </m:rPr>
+            <m:t>)</m:t>
+          </m:r>
+          <m:r>
+            <m:rPr>
+              <m:sty m:val="p"/>
+            </m:rPr>
+            <m:t>+</m:t>
+          </m:r>
+          <m:r>
+            <m:rPr>
+              <m:sty m:val="p"/>
+            </m:rPr>
+            <m:t>Δ</m:t>
+          </m:r>
+          <m:r>
+            <m:rPr>
+              <m:sty m:val="p"/>
+            </m:rPr>
+            <m:t>≤</m:t>
+          </m:r>
+          <m:acc>
+            <m:accPr>
+              <m:chr m:val="̂"/>
+            </m:accPr>
+            <m:e>
+              <m:r>
+                <m:t>g</m:t>
+              </m:r>
+            </m:e>
+          </m:acc>
+          <m:r>
+            <m:rPr>
+              <m:sty m:val="p"/>
+            </m:rPr>
+            <m:t>}</m:t>
+          </m:r>
+          <m:r>
+            <m:rPr>
+              <m:sty m:val="p"/>
+            </m:rPr>
+            <m:t>,</m:t>
+          </m:r>
+        </m:oMath>
+      </m:oMathPara>
+    </w:p>
+    <w:p>
+      <w:pPr>
+        <w:pStyle w:val="FirstParagraph"/>
+      </w:pPr>
+      <w:r>
+        <w:t xml:space="preserve">with reference target</w:t>
+      </w:r>
+      <w:r>
+        <w:t xml:space="preserve"> </w:t>
+      </w:r>
+      <m:oMath>
+        <m:sSub>
+          <m:e>
+            <m:r>
+              <m:t>β</m:t>
+            </m:r>
+          </m:e>
+          <m:sub>
+            <m:r>
+              <m:t>0</m:t>
+            </m:r>
+          </m:sub>
+        </m:sSub>
+        <m:r>
+          <m:rPr>
+            <m:sty m:val="p"/>
+          </m:rPr>
+          <m:t>=</m:t>
+        </m:r>
+        <m:sSup>
+          <m:e>
+            <m:r>
+              <m:t>10</m:t>
+            </m:r>
+          </m:e>
+          <m:sup>
+            <m:r>
+              <m:rPr>
+                <m:sty m:val="p"/>
+              </m:rPr>
+              <m:t>−</m:t>
+            </m:r>
+            <m:r>
+              <m:t>1</m:t>
+            </m:r>
+          </m:sup>
+        </m:sSup>
+      </m:oMath>
+      <w:r>
+        <w:t xml:space="preserve"> </w:t>
+      </w:r>
+      <w:r>
+        <w:t xml:space="preserve">and</w:t>
+      </w:r>
+      <w:r>
+        <w:t xml:space="preserve"> </w:t>
+      </w:r>
+      <m:oMath>
+        <m:r>
+          <m:rPr>
+            <m:sty m:val="p"/>
+          </m:rPr>
+          <m:t>Δ</m:t>
+        </m:r>
+        <m:r>
+          <m:rPr>
+            <m:sty m:val="p"/>
+          </m:rPr>
+          <m:t>=</m:t>
+        </m:r>
+        <m:r>
+          <m:t>0</m:t>
+        </m:r>
+      </m:oMath>
+      <w:r>
+        <w:t xml:space="preserve"> </w:t>
+      </w:r>
+      <w:r>
+        <w:t xml:space="preserve">for the naive policy. The</w:t>
       </w:r>
       <w:r>
         <w:t xml:space="preserve"> </w:t>
@@ -907,13 +1771,18 @@
         <w:t xml:space="preserve"> </w:t>
       </w:r>
       <w:r>
-        <w:t xml:space="preserve">is that rate</w:t>
-      </w:r>
-      <w:r>
-        <w:t xml:space="preserve"> </w:t>
-      </w:r>
-      <w:r>
-        <w:t xml:space="preserve">decision under a specific reliability target; the</w:t>
+        <w:t xml:space="preserve">is a reliability target</w:t>
+      </w:r>
+      <w:r>
+        <w:t xml:space="preserve"> </w:t>
+      </w:r>
+      <m:oMath>
+        <m:r>
+          <m:t>β</m:t>
+        </m:r>
+      </m:oMath>
+      <w:r>
+        <w:t xml:space="preserve">; the</w:t>
       </w:r>
       <w:r>
         <w:t xml:space="preserve"> </w:t>
@@ -929,13 +1798,1154 @@
         <w:t xml:space="preserve"> </w:t>
       </w:r>
       <w:r>
-        <w:t xml:space="preserve">is the LDPC decode</w:t>
-      </w:r>
-      <w:r>
-        <w:t xml:space="preserve"> </w:t>
-      </w:r>
-      <w:r>
-        <w:t xml:space="preserve">outcome. A false-clear is a certificate that clears an MCS the witness then fails.</w:t>
+        <w:t xml:space="preserve">is the LDPC decode of</w:t>
+      </w:r>
+      <w:r>
+        <w:t xml:space="preserve"> </w:t>
+      </w:r>
+      <m:oMath>
+        <m:sSup>
+          <m:e>
+            <m:r>
+              <m:t>m</m:t>
+            </m:r>
+          </m:e>
+          <m:sup>
+            <m:r>
+              <m:rPr>
+                <m:sty m:val="p"/>
+              </m:rPr>
+              <m:t>⋆</m:t>
+            </m:r>
+          </m:sup>
+        </m:sSup>
+      </m:oMath>
+      <w:r>
+        <w:t xml:space="preserve"> </w:t>
+      </w:r>
+      <w:r>
+        <w:t xml:space="preserve">at the</w:t>
+      </w:r>
+      <w:r>
+        <w:t xml:space="preserve"> </w:t>
+      </w:r>
+      <w:r>
+        <w:rPr>
+          <w:i/>
+          <w:iCs/>
+        </w:rPr>
+        <w:t xml:space="preserve">true</w:t>
+      </w:r>
+      <w:r>
+        <w:t xml:space="preserve"> </w:t>
+      </w:r>
+      <w:r>
+        <w:t xml:space="preserve">SNR. A false-clear is a cleared MCS the channel cannot</w:t>
+      </w:r>
+      <w:r>
+        <w:t xml:space="preserve"> </w:t>
+      </w:r>
+      <w:r>
+        <w:t xml:space="preserve">support,</w:t>
+      </w:r>
+      <w:r>
+        <w:t xml:space="preserve"> </w:t>
+      </w:r>
+      <m:oMath>
+        <m:sSub>
+          <m:e>
+            <m:r>
+              <m:t>ρ</m:t>
+            </m:r>
+          </m:e>
+          <m:sub>
+            <m:sSup>
+              <m:e>
+                <m:r>
+                  <m:t>m</m:t>
+                </m:r>
+              </m:e>
+              <m:sup>
+                <m:r>
+                  <m:rPr>
+                    <m:sty m:val="p"/>
+                  </m:rPr>
+                  <m:t>⋆</m:t>
+                </m:r>
+              </m:sup>
+            </m:sSup>
+          </m:sub>
+        </m:sSub>
+        <m:r>
+          <m:rPr>
+            <m:sty m:val="p"/>
+          </m:rPr>
+          <m:t>(</m:t>
+        </m:r>
+        <m:r>
+          <m:t>β</m:t>
+        </m:r>
+        <m:r>
+          <m:rPr>
+            <m:sty m:val="p"/>
+          </m:rPr>
+          <m:t>)</m:t>
+        </m:r>
+        <m:r>
+          <m:rPr>
+            <m:sty m:val="p"/>
+          </m:rPr>
+          <m:t>&gt;</m:t>
+        </m:r>
+        <m:r>
+          <m:t>γ</m:t>
+        </m:r>
+        <m:r>
+          <m:rPr>
+            <m:sty m:val="p"/>
+          </m:rPr>
+          <m:t>(</m:t>
+        </m:r>
+        <m:r>
+          <m:t>t</m:t>
+        </m:r>
+        <m:r>
+          <m:rPr>
+            <m:sty m:val="p"/>
+          </m:rPr>
+          <m:t>)</m:t>
+        </m:r>
+      </m:oMath>
+      <w:r>
+        <w:t xml:space="preserve">, and the measured, consumer-relative</w:t>
+      </w:r>
+      <w:r>
+        <w:t xml:space="preserve"> </w:t>
+      </w:r>
+      <w:r>
+        <w:t xml:space="preserve">false-clear rate is the witnessed BLER of the selected MCS,</w:t>
+      </w:r>
+    </w:p>
+    <w:p>
+      <w:pPr>
+        <w:pStyle w:val="BodyText"/>
+      </w:pPr>
+      <m:oMathPara>
+        <m:oMathParaPr>
+          <m:jc m:val="center"/>
+        </m:oMathParaPr>
+        <m:oMath>
+          <m:r>
+            <m:rPr>
+              <m:sty m:val="p"/>
+            </m:rPr>
+            <m:t>F</m:t>
+          </m:r>
+          <m:r>
+            <m:rPr>
+              <m:sty m:val="p"/>
+            </m:rPr>
+            <m:t>C</m:t>
+          </m:r>
+          <m:r>
+            <m:rPr>
+              <m:sty m:val="p"/>
+            </m:rPr>
+            <m:t>(</m:t>
+          </m:r>
+          <m:r>
+            <m:t>β</m:t>
+          </m:r>
+          <m:r>
+            <m:rPr>
+              <m:sty m:val="p"/>
+            </m:rPr>
+            <m:t>)</m:t>
+          </m:r>
+          <m:r>
+            <m:rPr>
+              <m:sty m:val="p"/>
+            </m:rPr>
+            <m:t>=</m:t>
+          </m:r>
+          <m:f>
+            <m:fPr>
+              <m:type m:val="lin"/>
+            </m:fPr>
+            <m:num>
+              <m:r>
+                <m:t>1</m:t>
+              </m:r>
+            </m:num>
+            <m:den>
+              <m:r>
+                <m:t>T</m:t>
+              </m:r>
+            </m:den>
+          </m:f>
+          <m:nary>
+            <m:naryPr>
+              <m:chr m:val="∑"/>
+              <m:limLoc m:val="undOvr"/>
+              <m:subHide m:val="off"/>
+              <m:supHide m:val="off"/>
+            </m:naryPr>
+            <m:sub>
+              <m:r>
+                <m:t>t</m:t>
+              </m:r>
+              <m:r>
+                <m:rPr>
+                  <m:sty m:val="p"/>
+                </m:rPr>
+                <m:t>=</m:t>
+              </m:r>
+              <m:r>
+                <m:t>1</m:t>
+              </m:r>
+            </m:sub>
+            <m:sup>
+              <m:r>
+                <m:t>T</m:t>
+              </m:r>
+            </m:sup>
+            <m:e>
+              <m:sSub>
+                <m:e>
+                  <m:r>
+                    <m:t>e</m:t>
+                  </m:r>
+                </m:e>
+                <m:sub>
+                  <m:r>
+                    <m:t> </m:t>
+                  </m:r>
+                  <m:sSup>
+                    <m:e>
+                      <m:r>
+                        <m:t>m</m:t>
+                      </m:r>
+                    </m:e>
+                    <m:sup>
+                      <m:r>
+                        <m:rPr>
+                          <m:sty m:val="p"/>
+                        </m:rPr>
+                        <m:t>⋆</m:t>
+                      </m:r>
+                    </m:sup>
+                  </m:sSup>
+                  <m:r>
+                    <m:rPr>
+                      <m:sty m:val="p"/>
+                    </m:rPr>
+                    <m:t>(</m:t>
+                  </m:r>
+                  <m:acc>
+                    <m:accPr>
+                      <m:chr m:val="̂"/>
+                    </m:accPr>
+                    <m:e>
+                      <m:r>
+                        <m:t>g</m:t>
+                      </m:r>
+                    </m:e>
+                  </m:acc>
+                  <m:r>
+                    <m:rPr>
+                      <m:sty m:val="p"/>
+                    </m:rPr>
+                    <m:t>(</m:t>
+                  </m:r>
+                  <m:r>
+                    <m:t>t</m:t>
+                  </m:r>
+                  <m:r>
+                    <m:rPr>
+                      <m:sty m:val="p"/>
+                    </m:rPr>
+                    <m:t>)</m:t>
+                  </m:r>
+                  <m:r>
+                    <m:rPr>
+                      <m:sty m:val="p"/>
+                    </m:rPr>
+                    <m:t>)</m:t>
+                  </m:r>
+                </m:sub>
+              </m:sSub>
+            </m:e>
+          </m:nary>
+          <m:r>
+            <m:t>​</m:t>
+          </m:r>
+          <m:d>
+            <m:dPr>
+              <m:begChr m:val="("/>
+              <m:sepChr m:val=""/>
+              <m:endChr m:val=")"/>
+              <m:grow/>
+            </m:dPr>
+            <m:e>
+              <m:r>
+                <m:t>γ</m:t>
+              </m:r>
+              <m:r>
+                <m:rPr>
+                  <m:sty m:val="p"/>
+                </m:rPr>
+                <m:t>(</m:t>
+              </m:r>
+              <m:r>
+                <m:t>t</m:t>
+              </m:r>
+              <m:r>
+                <m:rPr>
+                  <m:sty m:val="p"/>
+                </m:rPr>
+                <m:t>)</m:t>
+              </m:r>
+            </m:e>
+          </m:d>
+          <m:r>
+            <m:rPr>
+              <m:sty m:val="p"/>
+            </m:rPr>
+            <m:t>,</m:t>
+          </m:r>
+        </m:oMath>
+      </m:oMathPara>
+    </w:p>
+    <w:p>
+      <w:pPr>
+        <w:pStyle w:val="FirstParagraph"/>
+      </w:pPr>
+      <w:r>
+        <w:t xml:space="preserve">read against</w:t>
+      </w:r>
+      <w:r>
+        <w:t xml:space="preserve"> </w:t>
+      </w:r>
+      <m:oMath>
+        <m:r>
+          <m:t>β</m:t>
+        </m:r>
+      </m:oMath>
+      <w:r>
+        <w:t xml:space="preserve">. Because</w:t>
+      </w:r>
+      <w:r>
+        <w:t xml:space="preserve"> </w:t>
+      </w:r>
+      <w:hyperlink w:anchor="eq:cert">
+        <w:r>
+          <w:rPr>
+            <w:rStyle w:val="Hyperlink"/>
+          </w:rPr>
+          <w:t xml:space="preserve">[eq:cert]</w:t>
+        </w:r>
+      </w:hyperlink>
+      <w:r>
+        <w:t xml:space="preserve">–</w:t>
+      </w:r>
+      <w:hyperlink w:anchor="eq:fc">
+        <w:r>
+          <w:rPr>
+            <w:rStyle w:val="Hyperlink"/>
+          </w:rPr>
+          <w:t xml:space="preserve">[eq:fc]</w:t>
+        </w:r>
+      </w:hyperlink>
+      <w:r>
+        <w:t xml:space="preserve"> </w:t>
+      </w:r>
+      <w:r>
+        <w:t xml:space="preserve">are judged against</w:t>
+      </w:r>
+      <w:r>
+        <w:t xml:space="preserve"> </w:t>
+      </w:r>
+      <m:oMath>
+        <m:r>
+          <m:t>β</m:t>
+        </m:r>
+      </m:oMath>
+      <w:r>
+        <w:t xml:space="preserve">,</w:t>
+      </w:r>
+      <w:r>
+        <w:t xml:space="preserve"> </w:t>
+      </w:r>
+      <w:r>
+        <w:t xml:space="preserve">one trace</w:t>
+      </w:r>
+      <w:r>
+        <w:t xml:space="preserve"> </w:t>
+      </w:r>
+      <m:oMath>
+        <m:r>
+          <m:rPr>
+            <m:sty m:val="p"/>
+          </m:rPr>
+          <m:t>{</m:t>
+        </m:r>
+        <m:acc>
+          <m:accPr>
+            <m:chr m:val="̂"/>
+          </m:accPr>
+          <m:e>
+            <m:r>
+              <m:t>g</m:t>
+            </m:r>
+          </m:e>
+        </m:acc>
+        <m:r>
+          <m:rPr>
+            <m:sty m:val="p"/>
+          </m:rPr>
+          <m:t>(</m:t>
+        </m:r>
+        <m:r>
+          <m:t>t</m:t>
+        </m:r>
+        <m:r>
+          <m:rPr>
+            <m:sty m:val="p"/>
+          </m:rPr>
+          <m:t>)</m:t>
+        </m:r>
+        <m:r>
+          <m:rPr>
+            <m:sty m:val="p"/>
+          </m:rPr>
+          <m:t>,</m:t>
+        </m:r>
+        <m:r>
+          <m:t>γ</m:t>
+        </m:r>
+        <m:r>
+          <m:rPr>
+            <m:sty m:val="p"/>
+          </m:rPr>
+          <m:t>(</m:t>
+        </m:r>
+        <m:r>
+          <m:t>t</m:t>
+        </m:r>
+        <m:r>
+          <m:rPr>
+            <m:sty m:val="p"/>
+          </m:rPr>
+          <m:t>)</m:t>
+        </m:r>
+        <m:r>
+          <m:rPr>
+            <m:sty m:val="p"/>
+          </m:rPr>
+          <m:t>}</m:t>
+        </m:r>
+      </m:oMath>
+      <w:r>
+        <w:t xml:space="preserve"> </w:t>
+      </w:r>
+      <w:r>
+        <w:t xml:space="preserve">yields different verdicts for the eMBB (</w:t>
+      </w:r>
+      <m:oMath>
+        <m:r>
+          <m:t>β</m:t>
+        </m:r>
+        <m:r>
+          <m:rPr>
+            <m:sty m:val="p"/>
+          </m:rPr>
+          <m:t>=</m:t>
+        </m:r>
+        <m:sSup>
+          <m:e>
+            <m:r>
+              <m:t>10</m:t>
+            </m:r>
+          </m:e>
+          <m:sup>
+            <m:r>
+              <m:rPr>
+                <m:sty m:val="p"/>
+              </m:rPr>
+              <m:t>−</m:t>
+            </m:r>
+            <m:r>
+              <m:t>1</m:t>
+            </m:r>
+          </m:sup>
+        </m:sSup>
+      </m:oMath>
+      <w:r>
+        <w:t xml:space="preserve">)</w:t>
+      </w:r>
+      <w:r>
+        <w:t xml:space="preserve"> </w:t>
+      </w:r>
+      <w:r>
+        <w:t xml:space="preserve">and URLLC (</w:t>
+      </w:r>
+      <m:oMath>
+        <m:r>
+          <m:t>β</m:t>
+        </m:r>
+        <m:r>
+          <m:rPr>
+            <m:sty m:val="p"/>
+          </m:rPr>
+          <m:t>=</m:t>
+        </m:r>
+        <m:sSup>
+          <m:e>
+            <m:r>
+              <m:t>10</m:t>
+            </m:r>
+          </m:e>
+          <m:sup>
+            <m:r>
+              <m:rPr>
+                <m:sty m:val="p"/>
+              </m:rPr>
+              <m:t>−</m:t>
+            </m:r>
+            <m:r>
+              <m:t>3</m:t>
+            </m:r>
+          </m:sup>
+        </m:sSup>
+      </m:oMath>
+      <w:r>
+        <w:t xml:space="preserve">) consumers—the consumer-relativity we measure. The</w:t>
+      </w:r>
+      <w:r>
+        <w:t xml:space="preserve"> </w:t>
+      </w:r>
+      <w:r>
+        <w:t xml:space="preserve">URLLC-aware certificate raises</w:t>
+      </w:r>
+      <w:r>
+        <w:t xml:space="preserve"> </w:t>
+      </w:r>
+      <m:oMath>
+        <m:r>
+          <m:rPr>
+            <m:sty m:val="p"/>
+          </m:rPr>
+          <m:t>Δ</m:t>
+        </m:r>
+      </m:oMath>
+      <w:r>
+        <w:t xml:space="preserve"> </w:t>
+      </w:r>
+      <w:r>
+        <w:t xml:space="preserve">and combines</w:t>
+      </w:r>
+      <w:r>
+        <w:t xml:space="preserve"> </w:t>
+      </w:r>
+      <m:oMath>
+        <m:r>
+          <m:t>K</m:t>
+        </m:r>
+      </m:oMath>
+      <w:r>
+        <w:t xml:space="preserve"> </w:t>
+      </w:r>
+      <w:r>
+        <w:t xml:space="preserve">independent branches, failing</w:t>
+      </w:r>
+      <w:r>
+        <w:t xml:space="preserve"> </w:t>
+      </w:r>
+      <w:r>
+        <w:t xml:space="preserve">only if all fail:</w:t>
+      </w:r>
+      <w:r>
+        <w:t xml:space="preserve"> </w:t>
+      </w:r>
+      <m:oMath>
+        <m:sSub>
+          <m:e>
+            <m:r>
+              <m:rPr>
+                <m:sty m:val="p"/>
+              </m:rPr>
+              <m:t>F</m:t>
+            </m:r>
+            <m:r>
+              <m:rPr>
+                <m:sty m:val="p"/>
+              </m:rPr>
+              <m:t>C</m:t>
+            </m:r>
+          </m:e>
+          <m:sub>
+            <m:r>
+              <m:rPr>
+                <m:nor/>
+                <m:sty m:val="p"/>
+              </m:rPr>
+              <m:t>aware</m:t>
+            </m:r>
+          </m:sub>
+        </m:sSub>
+        <m:r>
+          <m:rPr>
+            <m:sty m:val="p"/>
+          </m:rPr>
+          <m:t>=</m:t>
+        </m:r>
+        <m:f>
+          <m:fPr>
+            <m:type m:val="lin"/>
+          </m:fPr>
+          <m:num>
+            <m:r>
+              <m:t>1</m:t>
+            </m:r>
+          </m:num>
+          <m:den>
+            <m:r>
+              <m:t>T</m:t>
+            </m:r>
+          </m:den>
+        </m:f>
+        <m:nary>
+          <m:naryPr>
+            <m:chr m:val="∑"/>
+            <m:limLoc m:val="undOvr"/>
+            <m:subHide m:val="off"/>
+            <m:supHide m:val="on"/>
+          </m:naryPr>
+          <m:sub>
+            <m:r>
+              <m:t>t</m:t>
+            </m:r>
+          </m:sub>
+          <m:sup>
+            <m:r>
+              <m:t>​</m:t>
+            </m:r>
+          </m:sup>
+          <m:e>
+            <m:nary>
+              <m:naryPr>
+                <m:chr m:val="∏"/>
+                <m:limLoc m:val="undOvr"/>
+                <m:subHide m:val="off"/>
+                <m:supHide m:val="off"/>
+              </m:naryPr>
+              <m:sub>
+                <m:r>
+                  <m:t>k</m:t>
+                </m:r>
+                <m:r>
+                  <m:rPr>
+                    <m:sty m:val="p"/>
+                  </m:rPr>
+                  <m:t>=</m:t>
+                </m:r>
+                <m:r>
+                  <m:t>1</m:t>
+                </m:r>
+              </m:sub>
+              <m:sup>
+                <m:r>
+                  <m:t>K</m:t>
+                </m:r>
+              </m:sup>
+              <m:e>
+                <m:sSub>
+                  <m:e>
+                    <m:r>
+                      <m:t>e</m:t>
+                    </m:r>
+                  </m:e>
+                  <m:sub>
+                    <m:sSup>
+                      <m:e>
+                        <m:r>
+                          <m:t>m</m:t>
+                        </m:r>
+                      </m:e>
+                      <m:sup>
+                        <m:r>
+                          <m:rPr>
+                            <m:sty m:val="p"/>
+                          </m:rPr>
+                          <m:t>⋆</m:t>
+                        </m:r>
+                      </m:sup>
+                    </m:sSup>
+                  </m:sub>
+                </m:sSub>
+              </m:e>
+            </m:nary>
+          </m:e>
+        </m:nary>
+        <m:r>
+          <m:rPr>
+            <m:sty m:val="p"/>
+          </m:rPr>
+          <m:t>(</m:t>
+        </m:r>
+        <m:sSub>
+          <m:e>
+            <m:r>
+              <m:t>γ</m:t>
+            </m:r>
+          </m:e>
+          <m:sub>
+            <m:r>
+              <m:t>k</m:t>
+            </m:r>
+          </m:sub>
+        </m:sSub>
+        <m:r>
+          <m:rPr>
+            <m:sty m:val="p"/>
+          </m:rPr>
+          <m:t>(</m:t>
+        </m:r>
+        <m:r>
+          <m:t>t</m:t>
+        </m:r>
+        <m:r>
+          <m:rPr>
+            <m:sty m:val="p"/>
+          </m:rPr>
+          <m:t>)</m:t>
+        </m:r>
+        <m:r>
+          <m:rPr>
+            <m:sty m:val="p"/>
+          </m:rPr>
+          <m:t>)</m:t>
+        </m:r>
+      </m:oMath>
+      <w:r>
+        <w:t xml:space="preserve">.</w:t>
+      </w:r>
+      <w:r>
+        <w:t xml:space="preserve"> </w:t>
+      </w:r>
+      <w:r>
+        <w:t xml:space="preserve">The witnessed</w:t>
+      </w:r>
+      <w:r>
+        <w:t xml:space="preserve"> </w:t>
+      </w:r>
+      <w:r>
+        <w:rPr>
+          <w:i/>
+          <w:iCs/>
+        </w:rPr>
+        <w:t xml:space="preserve">OLLA</w:t>
+      </w:r>
+      <w:r>
+        <w:t xml:space="preserve"> </w:t>
+      </w:r>
+      <w:r>
+        <w:t xml:space="preserve">correction (§</w:t>
+      </w:r>
+      <w:hyperlink w:anchor="sec:refresh">
+        <w:r>
+          <w:rPr>
+            <w:rStyle w:val="Hyperlink"/>
+          </w:rPr>
+          <w:t xml:space="preserve">4</w:t>
+        </w:r>
+      </w:hyperlink>
+      <w:r>
+        <w:t xml:space="preserve">) distrusts</w:t>
+      </w:r>
+      <w:r>
+        <w:t xml:space="preserve"> </w:t>
+      </w:r>
+      <m:oMath>
+        <m:acc>
+          <m:accPr>
+            <m:chr m:val="̂"/>
+          </m:accPr>
+          <m:e>
+            <m:r>
+              <m:t>g</m:t>
+            </m:r>
+          </m:e>
+        </m:acc>
+      </m:oMath>
+      <w:r>
+        <w:t xml:space="preserve"> </w:t>
+      </w:r>
+      <w:r>
+        <w:t xml:space="preserve">and selects</w:t>
+      </w:r>
+      <w:r>
+        <w:t xml:space="preserve"> </w:t>
+      </w:r>
+      <m:oMath>
+        <m:sSup>
+          <m:e>
+            <m:r>
+              <m:t>m</m:t>
+            </m:r>
+          </m:e>
+          <m:sup>
+            <m:r>
+              <m:rPr>
+                <m:sty m:val="p"/>
+              </m:rPr>
+              <m:t>⋆</m:t>
+            </m:r>
+          </m:sup>
+        </m:sSup>
+        <m:r>
+          <m:rPr>
+            <m:sty m:val="p"/>
+          </m:rPr>
+          <m:t>(</m:t>
+        </m:r>
+        <m:acc>
+          <m:accPr>
+            <m:chr m:val="̂"/>
+          </m:accPr>
+          <m:e>
+            <m:r>
+              <m:t>g</m:t>
+            </m:r>
+          </m:e>
+        </m:acc>
+        <m:r>
+          <m:rPr>
+            <m:sty m:val="p"/>
+          </m:rPr>
+          <m:t>(</m:t>
+        </m:r>
+        <m:r>
+          <m:t>t</m:t>
+        </m:r>
+        <m:r>
+          <m:rPr>
+            <m:sty m:val="p"/>
+          </m:rPr>
+          <m:t>)</m:t>
+        </m:r>
+        <m:r>
+          <m:rPr>
+            <m:sty m:val="p"/>
+          </m:rPr>
+          <m:t>−</m:t>
+        </m:r>
+        <m:r>
+          <m:t>o</m:t>
+        </m:r>
+        <m:r>
+          <m:rPr>
+            <m:sty m:val="p"/>
+          </m:rPr>
+          <m:t>(</m:t>
+        </m:r>
+        <m:r>
+          <m:t>t</m:t>
+        </m:r>
+        <m:r>
+          <m:rPr>
+            <m:sty m:val="p"/>
+          </m:rPr>
+          <m:t>)</m:t>
+        </m:r>
+        <m:r>
+          <m:rPr>
+            <m:sty m:val="p"/>
+          </m:rPr>
+          <m:t>)</m:t>
+        </m:r>
+      </m:oMath>
+      <w:r>
+        <w:t xml:space="preserve"> </w:t>
+      </w:r>
+      <w:r>
+        <w:t xml:space="preserve">with an offset driven by HARQ feedback,</w:t>
+      </w:r>
+    </w:p>
+    <w:p>
+      <w:pPr>
+        <w:pStyle w:val="BodyText"/>
+      </w:pPr>
+      <m:oMathPara>
+        <m:oMathParaPr>
+          <m:jc m:val="center"/>
+        </m:oMathParaPr>
+        <m:oMath>
+          <m:r>
+            <m:t>o</m:t>
+          </m:r>
+          <m:r>
+            <m:rPr>
+              <m:sty m:val="p"/>
+            </m:rPr>
+            <m:t>(</m:t>
+          </m:r>
+          <m:r>
+            <m:t>t</m:t>
+          </m:r>
+          <m:r>
+            <m:rPr>
+              <m:sty m:val="p"/>
+            </m:rPr>
+            <m:t>+</m:t>
+          </m:r>
+          <m:r>
+            <m:t>1</m:t>
+          </m:r>
+          <m:r>
+            <m:rPr>
+              <m:sty m:val="p"/>
+            </m:rPr>
+            <m:t>)</m:t>
+          </m:r>
+          <m:r>
+            <m:rPr>
+              <m:sty m:val="p"/>
+            </m:rPr>
+            <m:t>=</m:t>
+          </m:r>
+          <m:r>
+            <m:t>o</m:t>
+          </m:r>
+          <m:r>
+            <m:rPr>
+              <m:sty m:val="p"/>
+            </m:rPr>
+            <m:t>(</m:t>
+          </m:r>
+          <m:r>
+            <m:t>t</m:t>
+          </m:r>
+          <m:r>
+            <m:rPr>
+              <m:sty m:val="p"/>
+            </m:rPr>
+            <m:t>)</m:t>
+          </m:r>
+          <m:r>
+            <m:rPr>
+              <m:sty m:val="p"/>
+            </m:rPr>
+            <m:t>+</m:t>
+          </m:r>
+          <m:r>
+            <m:t>μ</m:t>
+          </m:r>
+          <m:d>
+            <m:dPr>
+              <m:begChr m:val="("/>
+              <m:sepChr m:val=""/>
+              <m:endChr m:val=")"/>
+              <m:grow/>
+            </m:dPr>
+            <m:e>
+              <m:r>
+                <m:rPr>
+                  <m:sty m:val="b"/>
+                </m:rPr>
+                <m:t>1</m:t>
+              </m:r>
+              <m:r>
+                <m:rPr>
+                  <m:sty m:val="p"/>
+                </m:rPr>
+                <m:t>[</m:t>
+              </m:r>
+              <m:r>
+                <m:rPr>
+                  <m:nor/>
+                  <m:sty m:val="p"/>
+                </m:rPr>
+                <m:t>NACK</m:t>
+              </m:r>
+              <m:r>
+                <m:rPr>
+                  <m:sty m:val="p"/>
+                </m:rPr>
+                <m:t>(</m:t>
+              </m:r>
+              <m:r>
+                <m:t>t</m:t>
+              </m:r>
+              <m:r>
+                <m:rPr>
+                  <m:sty m:val="p"/>
+                </m:rPr>
+                <m:t>)</m:t>
+              </m:r>
+              <m:r>
+                <m:rPr>
+                  <m:sty m:val="p"/>
+                </m:rPr>
+                <m:t>]</m:t>
+              </m:r>
+              <m:r>
+                <m:rPr>
+                  <m:sty m:val="p"/>
+                </m:rPr>
+                <m:t>−</m:t>
+              </m:r>
+              <m:r>
+                <m:t>β</m:t>
+              </m:r>
+            </m:e>
+          </m:d>
+          <m:r>
+            <m:rPr>
+              <m:sty m:val="p"/>
+            </m:rPr>
+            <m:t>,</m:t>
+          </m:r>
+        </m:oMath>
+      </m:oMathPara>
+    </w:p>
+    <w:p>
+      <w:pPr>
+        <w:pStyle w:val="FirstParagraph"/>
+      </w:pPr>
+      <w:r>
+        <w:t xml:space="preserve">which drives the empirical error rate toward</w:t>
+      </w:r>
+      <w:r>
+        <w:t xml:space="preserve"> </w:t>
+      </w:r>
+      <m:oMath>
+        <m:r>
+          <m:t>β</m:t>
+        </m:r>
+      </m:oMath>
+      <w:r>
+        <w:t xml:space="preserve"> </w:t>
+      </w:r>
+      <w:r>
+        <w:t xml:space="preserve">under stale CSI. For held CSI the</w:t>
+      </w:r>
+      <w:r>
+        <w:t xml:space="preserve"> </w:t>
+      </w:r>
+      <w:r>
+        <w:rPr>
+          <w:i/>
+          <w:iCs/>
+        </w:rPr>
+        <w:t xml:space="preserve">refresh floor</w:t>
+      </w:r>
+      <w:r>
+        <w:t xml:space="preserve"> </w:t>
+      </w:r>
+      <w:r>
+        <w:t xml:space="preserve">is the largest period meeting target,</w:t>
+      </w:r>
+      <w:r>
+        <w:t xml:space="preserve"> </w:t>
+      </w:r>
+      <m:oMath>
+        <m:sSup>
+          <m:e>
+            <m:r>
+              <m:t>P</m:t>
+            </m:r>
+          </m:e>
+          <m:sup>
+            <m:r>
+              <m:rPr>
+                <m:sty m:val="p"/>
+              </m:rPr>
+              <m:t>⋆</m:t>
+            </m:r>
+          </m:sup>
+        </m:sSup>
+        <m:r>
+          <m:rPr>
+            <m:sty m:val="p"/>
+          </m:rPr>
+          <m:t>(</m:t>
+        </m:r>
+        <m:sSub>
+          <m:e>
+            <m:r>
+              <m:t>f</m:t>
+            </m:r>
+          </m:e>
+          <m:sub>
+            <m:r>
+              <m:t>D</m:t>
+            </m:r>
+          </m:sub>
+        </m:sSub>
+        <m:r>
+          <m:rPr>
+            <m:sty m:val="p"/>
+          </m:rPr>
+          <m:t>)</m:t>
+        </m:r>
+        <m:r>
+          <m:rPr>
+            <m:sty m:val="p"/>
+          </m:rPr>
+          <m:t>=</m:t>
+        </m:r>
+        <m:r>
+          <m:rPr>
+            <m:sty m:val="p"/>
+          </m:rPr>
+          <m:t>max</m:t>
+        </m:r>
+        <m:r>
+          <m:rPr>
+            <m:sty m:val="p"/>
+          </m:rPr>
+          <m:t>{</m:t>
+        </m:r>
+        <m:r>
+          <m:t>P</m:t>
+        </m:r>
+        <m:r>
+          <m:rPr>
+            <m:sty m:val="p"/>
+          </m:rPr>
+          <m:t>:</m:t>
+        </m:r>
+        <m:r>
+          <m:rPr>
+            <m:sty m:val="p"/>
+          </m:rPr>
+          <m:t>F</m:t>
+        </m:r>
+        <m:r>
+          <m:rPr>
+            <m:sty m:val="p"/>
+          </m:rPr>
+          <m:t>C</m:t>
+        </m:r>
+        <m:r>
+          <m:rPr>
+            <m:sty m:val="p"/>
+          </m:rPr>
+          <m:t>≤</m:t>
+        </m:r>
+        <m:r>
+          <m:t>β</m:t>
+        </m:r>
+        <m:r>
+          <m:rPr>
+            <m:sty m:val="p"/>
+          </m:rPr>
+          <m:t>}</m:t>
+        </m:r>
+      </m:oMath>
+      <w:r>
+        <w:t xml:space="preserve">.</w:t>
       </w:r>
     </w:p>
     <w:p>
@@ -2450,7 +4460,18 @@
         <w:t xml:space="preserve"> </w:t>
       </w:r>
       <w:r>
-        <w:t xml:space="preserve">roughly a quarter of transmissions—while OLLA, the deployed witnessed correction that</w:t>
+        <w:t xml:space="preserve">roughly a quarter of transmissions—while OLLA </w:t>
+      </w:r>
+      <w:hyperlink w:anchor="eq:olla">
+        <w:r>
+          <w:rPr>
+            <w:rStyle w:val="Hyperlink"/>
+          </w:rPr>
+          <w:t xml:space="preserve">[eq:olla]</w:t>
+        </w:r>
+      </w:hyperlink>
+      <w:r>
+        <w:t xml:space="preserve">, the deployed witnessed correction that</w:t>
       </w:r>
       <w:r>
         <w:t xml:space="preserve"> </w:t>

</xml_diff>

<commit_message>
WCNC: confirmed AI acknowledgment; TrueType fonts in figures
The acknowledgment now also discloses that Claude wrote the Lean proofs
and the claim-checking script (confirmed by the author).

Figures used matplotlib's default Type 3 fonts, which IEEE PDF eXpress
flags. The plot scripts now set pdf.fonttype 42, and the three affected
figures are regenerated from the unchanged sealed records (content
identical). EDAS-style check: 5 pp, US Letter, no page numbers, all
fonts embedded. Word copy rebuilt with its figures.

Co-Authored-By: Claude Opus 5.5 <noreply@anthropic.com>
</commit_message>
<xml_diff>
--- a/paper/wcnc-csi/wcnc-csi.docx
+++ b/paper/wcnc-csi/wcnc-csi.docx
@@ -5065,7 +5065,7 @@
       <w:r>
         <w:drawing>
           <wp:inline>
-            <wp:extent cx="3146881" cy="2504660"/>
+            <wp:extent cx="3131590" cy="2467962"/>
             <wp:effectExtent b="0" l="0" r="0" t="0"/>
             <wp:docPr descr="" title="" id="13" name="Picture"/>
             <a:graphic>
@@ -5086,7 +5086,7 @@
                   <pic:spPr bwMode="auto">
                     <a:xfrm>
                       <a:off x="0" y="0"/>
-                      <a:ext cx="3146881" cy="2504660"/>
+                      <a:ext cx="3131590" cy="2467962"/>
                     </a:xfrm>
                     <a:prstGeom prst="rect">
                       <a:avLst/>
@@ -8032,7 +8032,13 @@
         <w:t xml:space="preserve"> </w:t>
       </w:r>
       <w:r>
-        <w:t xml:space="preserve">and to check the reported numbers and references against the sealed records. The</w:t>
+        <w:t xml:space="preserve">to check the reported numbers and references against the sealed records, and to</w:t>
+      </w:r>
+      <w:r>
+        <w:t xml:space="preserve"> </w:t>
+      </w:r>
+      <w:r>
+        <w:t xml:space="preserve">write the Lean proofs and the claim-checking script. The</w:t>
       </w:r>
       <w:r>
         <w:t xml:space="preserve"> </w:t>

</xml_diff>